<commit_message>
convert contract file from docx to pdf
</commit_message>
<xml_diff>
--- a/src/main/resources/templates/contract/tenant-apartment-draft-template.docx
+++ b/src/main/resources/templates/contract/tenant-apartment-draft-template.docx
@@ -250,44 +250,6 @@
         </w:rPr>
         <w:t xml:space="preserve">Hôm nay, ngày ${signDay} tháng ${signMonth} năm ${signYear}, tại ${signPlace}, chúng tôi gồm:</w:t>
       </w:r>
-      <w:r>
-        <w:rPr>
-          <w:rFonts w:ascii="Times New Roman" w:cs="Times New Roman" w:eastAsia="Times New Roman" w:hAnsi="Times New Roman"/>
-          <w:sz w:val="25"/>
-          <w:szCs w:val="25"/>
-          <w:rtl w:val="0"/>
-        </w:rPr>
-        <w:t xml:space="preserve"/>
-      </w:r>
-      <w:r>
-        <w:rPr>
-          <w:rFonts w:ascii="Times New Roman" w:cs="Times New Roman" w:eastAsia="Times New Roman" w:hAnsi="Times New Roman"/>
-          <w:color w:val="000000"/>
-          <w:sz w:val="25"/>
-          <w:szCs w:val="25"/>
-          <w:rtl w:val="0"/>
-        </w:rPr>
-        <w:t xml:space="preserve"/>
-      </w:r>
-      <w:r>
-        <w:rPr>
-          <w:rFonts w:ascii="Times New Roman" w:cs="Times New Roman" w:eastAsia="Times New Roman" w:hAnsi="Times New Roman"/>
-          <w:sz w:val="25"/>
-          <w:szCs w:val="25"/>
-          <w:rtl w:val="0"/>
-        </w:rPr>
-        <w:t xml:space="preserve"/>
-      </w:r>
-      <w:r>
-        <w:rPr>
-          <w:rFonts w:ascii="Times New Roman" w:cs="Times New Roman" w:eastAsia="Times New Roman" w:hAnsi="Times New Roman"/>
-          <w:color w:val="000000"/>
-          <w:sz w:val="25"/>
-          <w:szCs w:val="25"/>
-          <w:rtl w:val="0"/>
-        </w:rPr>
-        <w:t xml:space="preserve"/>
-      </w:r>
     </w:p>
     <w:p>
       <w:pPr>
@@ -435,16 +397,20 @@
           <w:rtl w:val="0"/>
         </w:rPr>
         <w:t xml:space="preserve">HKTT</w:t>
-      </w:r>
-      <w:r>
-        <w:rPr>
-          <w:rFonts w:ascii="Times New Roman" w:cs="Times New Roman" w:eastAsia="Times New Roman" w:hAnsi="Times New Roman"/>
-          <w:sz w:val="25"/>
-          <w:szCs w:val="25"/>
-          <w:rtl w:val="0"/>
-        </w:rPr>
-        <w:t xml:space="preserve"/>
-      </w:r>
+        <w:br w:type="textWrapping"/>
+        <w:t xml:space="preserve">Điện thoại: ……………..……………</w:t>
+      </w:r>
+    </w:p>
+    <w:p>
+      <w:pPr>
+        <w:shd w:fill="ffffff" w:val="clear"/>
+        <w:spacing w:after="150" w:line="240" w:lineRule="auto"/>
+        <w:rPr>
+          <w:rFonts w:ascii="Times New Roman" w:cs="Times New Roman" w:eastAsia="Times New Roman" w:hAnsi="Times New Roman"/>
+          <w:sz w:val="25"/>
+          <w:szCs w:val="25"/>
+        </w:rPr>
+      </w:pPr>
       <w:r>
         <w:rPr>
           <w:rFonts w:ascii="Times New Roman" w:cs="Times New Roman" w:eastAsia="Times New Roman" w:hAnsi="Times New Roman"/>
@@ -455,21 +421,105 @@
           <w:szCs w:val="25"/>
           <w:rtl w:val="0"/>
         </w:rPr>
-        <w:br w:type="textWrapping"/>
-        <w:t xml:space="preserve">Điện thoại: ……………..……………</w:t>
-      </w:r>
-    </w:p>
-    <w:p>
-      <w:pPr>
-        <w:shd w:fill="ffffff" w:val="clear"/>
-        <w:spacing w:after="150" w:line="240" w:lineRule="auto"/>
-        <w:rPr>
-          <w:rFonts w:ascii="Times New Roman" w:cs="Times New Roman" w:eastAsia="Times New Roman" w:hAnsi="Times New Roman"/>
-          <w:sz w:val="25"/>
-          <w:szCs w:val="25"/>
-        </w:rPr>
-      </w:pPr>
-      <w:r>
+        <w:t xml:space="preserve">Là chủ cho thuê hợp pháp</w:t>
+      </w:r>
+      <w:r>
+        <w:rPr>
+          <w:rFonts w:ascii="Times New Roman" w:cs="Times New Roman" w:eastAsia="Times New Roman" w:hAnsi="Times New Roman"/>
+          <w:sz w:val="25"/>
+          <w:szCs w:val="25"/>
+          <w:rtl w:val="0"/>
+        </w:rPr>
+        <w:t xml:space="preserve">:.....................................................</w:t>
+      </w:r>
+    </w:p>
+    <w:p>
+      <w:pPr>
+        <w:shd w:fill="ffffff" w:val="clear"/>
+        <w:spacing w:after="150" w:line="240" w:lineRule="auto"/>
+        <w:rPr>
+          <w:rFonts w:ascii="Times New Roman" w:cs="Times New Roman" w:eastAsia="Times New Roman" w:hAnsi="Times New Roman"/>
+          <w:color w:val="000000"/>
+          <w:sz w:val="25"/>
+          <w:szCs w:val="25"/>
+        </w:rPr>
+      </w:pPr>
+      <w:r>
+        <w:rPr>
+          <w:rFonts w:ascii="Times New Roman" w:cs="Times New Roman" w:eastAsia="Times New Roman" w:hAnsi="Times New Roman"/>
+          <w:b w:val="1"/>
+          <w:bCs w:val="1"/>
+          <w:color w:val="000000"/>
+          <w:sz w:val="25"/>
+          <w:szCs w:val="25"/>
+          <w:u w:val="single"/>
+          <w:rtl w:val="0"/>
+        </w:rPr>
+        <w:t xml:space="preserve">Bên Thuê </w:t>
+      </w:r>
+      <w:r>
+        <w:rPr>
+          <w:rFonts w:ascii="Times New Roman" w:cs="Times New Roman" w:eastAsia="Times New Roman" w:hAnsi="Times New Roman"/>
+          <w:color w:val="000000"/>
+          <w:sz w:val="25"/>
+          <w:szCs w:val="25"/>
+          <w:rtl w:val="0"/>
+        </w:rPr>
+        <w:t xml:space="preserve">( Sau đây gọi tắt là </w:t>
+      </w:r>
+      <w:r>
+        <w:rPr>
+          <w:rFonts w:ascii="Times New Roman" w:cs="Times New Roman" w:eastAsia="Times New Roman" w:hAnsi="Times New Roman"/>
+          <w:b w:val="1"/>
+          <w:bCs w:val="1"/>
+          <w:color w:val="000000"/>
+          <w:sz w:val="25"/>
+          <w:szCs w:val="25"/>
+          <w:rtl w:val="0"/>
+        </w:rPr>
+        <w:t xml:space="preserve">Bên B</w:t>
+      </w:r>
+      <w:r>
+        <w:rPr>
+          <w:rFonts w:ascii="Times New Roman" w:cs="Times New Roman" w:eastAsia="Times New Roman" w:hAnsi="Times New Roman"/>
+          <w:color w:val="000000"/>
+          <w:sz w:val="25"/>
+          <w:szCs w:val="25"/>
+          <w:rtl w:val="0"/>
+        </w:rPr>
+        <w:t xml:space="preserve">)</w:t>
+      </w:r>
+    </w:p>
+    <w:p>
+      <w:pPr>
+        <w:shd w:fill="ffffff" w:val="clear"/>
+        <w:spacing w:after="0" w:line="240" w:lineRule="auto"/>
+        <w:rPr>
+          <w:rFonts w:ascii="Times New Roman" w:cs="Times New Roman" w:eastAsia="Times New Roman" w:hAnsi="Times New Roman"/>
+          <w:b w:val="1"/>
+          <w:bCs w:val="1"/>
+          <w:color w:val="000000"/>
+          <w:sz w:val="25"/>
+          <w:szCs w:val="25"/>
+        </w:rPr>
+      </w:pPr>
+      <w:r>
+        <w:rPr>
+          <w:rFonts w:ascii="Times New Roman" w:cs="Times New Roman" w:eastAsia="Times New Roman" w:hAnsi="Times New Roman"/>
+          <w:b w:val="1"/>
+          <w:bCs w:val="1"/>
+          <w:color w:val="000000"/>
+          <w:sz w:val="25"/>
+          <w:szCs w:val="25"/>
+          <w:rtl w:val="0"/>
+        </w:rPr>
+        <w:t xml:space="preserve">Ông/bà: ${tenantFullName}  </w:t>
+      </w:r>
+    </w:p>
+    <w:p>
+      <w:pPr>
+        <w:shd w:fill="ffffff" w:val="clear"/>
+        <w:spacing w:after="0" w:line="240" w:lineRule="auto"/>
         <w:rPr>
           <w:rFonts w:ascii="Times New Roman" w:cs="Times New Roman" w:eastAsia="Times New Roman" w:hAnsi="Times New Roman"/>
           <w:b w:val="0"/>
@@ -477,130 +527,9 @@
           <w:color w:val="000000"/>
           <w:sz w:val="25"/>
           <w:szCs w:val="25"/>
-          <w:rtl w:val="0"/>
-        </w:rPr>
-        <w:t xml:space="preserve">Là chủ cho thuê hợp pháp</w:t>
-      </w:r>
-      <w:r>
-        <w:rPr>
-          <w:rFonts w:ascii="Times New Roman" w:cs="Times New Roman" w:eastAsia="Times New Roman" w:hAnsi="Times New Roman"/>
-          <w:sz w:val="25"/>
-          <w:szCs w:val="25"/>
-          <w:rtl w:val="0"/>
-        </w:rPr>
-        <w:t xml:space="preserve">:.....................................................</w:t>
-      </w:r>
-    </w:p>
-    <w:p>
-      <w:pPr>
-        <w:shd w:fill="ffffff" w:val="clear"/>
-        <w:spacing w:after="150" w:line="240" w:lineRule="auto"/>
-        <w:rPr>
-          <w:rFonts w:ascii="Times New Roman" w:cs="Times New Roman" w:eastAsia="Times New Roman" w:hAnsi="Times New Roman"/>
-          <w:color w:val="000000"/>
-          <w:sz w:val="25"/>
-          <w:szCs w:val="25"/>
-        </w:rPr>
-      </w:pPr>
-      <w:r>
-        <w:rPr>
-          <w:rFonts w:ascii="Times New Roman" w:cs="Times New Roman" w:eastAsia="Times New Roman" w:hAnsi="Times New Roman"/>
-          <w:b w:val="1"/>
-          <w:bCs w:val="1"/>
-          <w:color w:val="000000"/>
-          <w:sz w:val="25"/>
-          <w:szCs w:val="25"/>
-          <w:u w:val="single"/>
-          <w:rtl w:val="0"/>
-        </w:rPr>
-        <w:t xml:space="preserve">Bên Thuê </w:t>
-      </w:r>
-      <w:r>
-        <w:rPr>
-          <w:rFonts w:ascii="Times New Roman" w:cs="Times New Roman" w:eastAsia="Times New Roman" w:hAnsi="Times New Roman"/>
-          <w:color w:val="000000"/>
-          <w:sz w:val="25"/>
-          <w:szCs w:val="25"/>
-          <w:rtl w:val="0"/>
-        </w:rPr>
-        <w:t xml:space="preserve">( Sau đây gọi tắt là </w:t>
-      </w:r>
-      <w:r>
-        <w:rPr>
-          <w:rFonts w:ascii="Times New Roman" w:cs="Times New Roman" w:eastAsia="Times New Roman" w:hAnsi="Times New Roman"/>
-          <w:b w:val="1"/>
-          <w:bCs w:val="1"/>
-          <w:color w:val="000000"/>
-          <w:sz w:val="25"/>
-          <w:szCs w:val="25"/>
-          <w:rtl w:val="0"/>
-        </w:rPr>
-        <w:t xml:space="preserve">Bên B</w:t>
-      </w:r>
-      <w:r>
-        <w:rPr>
-          <w:rFonts w:ascii="Times New Roman" w:cs="Times New Roman" w:eastAsia="Times New Roman" w:hAnsi="Times New Roman"/>
-          <w:color w:val="000000"/>
-          <w:sz w:val="25"/>
-          <w:szCs w:val="25"/>
-          <w:rtl w:val="0"/>
-        </w:rPr>
-        <w:t xml:space="preserve">)</w:t>
-      </w:r>
-    </w:p>
-    <w:p>
-      <w:pPr>
-        <w:shd w:fill="ffffff" w:val="clear"/>
-        <w:spacing w:after="0" w:line="240" w:lineRule="auto"/>
-        <w:rPr>
-          <w:rFonts w:ascii="Times New Roman" w:cs="Times New Roman" w:eastAsia="Times New Roman" w:hAnsi="Times New Roman"/>
-          <w:b w:val="1"/>
-          <w:bCs w:val="1"/>
-          <w:color w:val="000000"/>
-          <w:sz w:val="25"/>
-          <w:szCs w:val="25"/>
-        </w:rPr>
-      </w:pPr>
-      <w:r>
-        <w:rPr>
-          <w:rFonts w:ascii="Times New Roman" w:cs="Times New Roman" w:eastAsia="Times New Roman" w:hAnsi="Times New Roman"/>
-          <w:b w:val="1"/>
-          <w:bCs w:val="1"/>
-          <w:color w:val="000000"/>
-          <w:sz w:val="25"/>
-          <w:szCs w:val="25"/>
-          <w:rtl w:val="0"/>
-        </w:rPr>
-        <w:t xml:space="preserve">Ông/bà: ${tenantFullName}</w:t>
-      </w:r>
-      <w:r>
-        <w:rPr>
-          <w:rFonts w:ascii="Times New Roman" w:cs="Times New Roman" w:eastAsia="Times New Roman" w:hAnsi="Times New Roman"/>
-          <w:b w:val="1"/>
-          <w:bCs w:val="1"/>
-          <w:sz w:val="25"/>
-          <w:szCs w:val="25"/>
-          <w:rtl w:val="0"/>
-        </w:rPr>
-        <w:t xml:space="preserve"/>
-      </w:r>
-      <w:r>
-        <w:rPr>
-          <w:rFonts w:ascii="Times New Roman" w:cs="Times New Roman" w:eastAsia="Times New Roman" w:hAnsi="Times New Roman"/>
-          <w:b w:val="1"/>
-          <w:bCs w:val="1"/>
-          <w:color w:val="000000"/>
-          <w:sz w:val="25"/>
-          <w:szCs w:val="25"/>
-          <w:rtl w:val="0"/>
-        </w:rPr>
-        <w:t xml:space="preserve">  </w:t>
-      </w:r>
-    </w:p>
-    <w:p>
-      <w:pPr>
-        <w:shd w:fill="ffffff" w:val="clear"/>
-        <w:spacing w:after="0" w:line="240" w:lineRule="auto"/>
+        </w:rPr>
+      </w:pPr>
+      <w:r>
         <w:rPr>
           <w:rFonts w:ascii="Times New Roman" w:cs="Times New Roman" w:eastAsia="Times New Roman" w:hAnsi="Times New Roman"/>
           <w:b w:val="0"/>
@@ -608,19 +537,55 @@
           <w:color w:val="000000"/>
           <w:sz w:val="25"/>
           <w:szCs w:val="25"/>
-        </w:rPr>
-      </w:pPr>
-      <w:r>
-        <w:rPr>
-          <w:rFonts w:ascii="Times New Roman" w:cs="Times New Roman" w:eastAsia="Times New Roman" w:hAnsi="Times New Roman"/>
-          <w:color w:val="000000"/>
-          <w:sz w:val="25"/>
-          <w:szCs w:val="25"/>
-          <w:rtl w:val="0"/>
-        </w:rPr>
-        <w:t xml:space="preserve"/>
-      </w:r>
-      <w:r>
+          <w:rtl w:val="0"/>
+        </w:rPr>
+        <w:t xml:space="preserve">Số CCCD: ${tenantCccd} </w:t>
+      </w:r>
+    </w:p>
+    <w:p>
+      <w:pPr>
+        <w:shd w:fill="ffffff" w:val="clear"/>
+        <w:spacing w:after="0" w:line="240" w:lineRule="auto"/>
+        <w:rPr>
+          <w:rFonts w:ascii="Times New Roman" w:cs="Times New Roman" w:eastAsia="Times New Roman" w:hAnsi="Times New Roman"/>
+          <w:sz w:val="25"/>
+          <w:szCs w:val="25"/>
+        </w:rPr>
+      </w:pPr>
+      <w:r>
+        <w:rPr>
+          <w:rFonts w:ascii="Times New Roman" w:cs="Times New Roman" w:eastAsia="Times New Roman" w:hAnsi="Times New Roman"/>
+          <w:sz w:val="25"/>
+          <w:szCs w:val="25"/>
+          <w:rtl w:val="0"/>
+        </w:rPr>
+        <w:t xml:space="preserve">Nơi cấp: </w:t>
+      </w:r>
+    </w:p>
+    <w:p>
+      <w:pPr>
+        <w:shd w:fill="ffffff" w:val="clear"/>
+        <w:spacing w:after="0" w:line="240" w:lineRule="auto"/>
+        <w:rPr>
+          <w:rFonts w:ascii="Times New Roman" w:cs="Times New Roman" w:eastAsia="Times New Roman" w:hAnsi="Times New Roman"/>
+          <w:sz w:val="25"/>
+          <w:szCs w:val="25"/>
+        </w:rPr>
+      </w:pPr>
+      <w:r>
+        <w:rPr>
+          <w:rFonts w:ascii="Times New Roman" w:cs="Times New Roman" w:eastAsia="Times New Roman" w:hAnsi="Times New Roman"/>
+          <w:sz w:val="25"/>
+          <w:szCs w:val="25"/>
+          <w:rtl w:val="0"/>
+        </w:rPr>
+        <w:t xml:space="preserve">Ngày cấp: </w:t>
+      </w:r>
+    </w:p>
+    <w:p>
+      <w:pPr>
+        <w:shd w:fill="ffffff" w:val="clear"/>
+        <w:spacing w:after="0" w:line="240" w:lineRule="auto"/>
         <w:rPr>
           <w:rFonts w:ascii="Times New Roman" w:cs="Times New Roman" w:eastAsia="Times New Roman" w:hAnsi="Times New Roman"/>
           <w:b w:val="0"/>
@@ -628,19 +593,8 @@
           <w:color w:val="000000"/>
           <w:sz w:val="25"/>
           <w:szCs w:val="25"/>
-          <w:rtl w:val="0"/>
-        </w:rPr>
-        <w:t xml:space="preserve">Số CCCD: ${tenantCccd}</w:t>
-      </w:r>
-      <w:r>
-        <w:rPr>
-          <w:rFonts w:ascii="Times New Roman" w:cs="Times New Roman" w:eastAsia="Times New Roman" w:hAnsi="Times New Roman"/>
-          <w:sz w:val="25"/>
-          <w:szCs w:val="25"/>
-          <w:rtl w:val="0"/>
-        </w:rPr>
-        <w:t xml:space="preserve"/>
-      </w:r>
+        </w:rPr>
+      </w:pPr>
       <w:r>
         <w:rPr>
           <w:rFonts w:ascii="Times New Roman" w:cs="Times New Roman" w:eastAsia="Times New Roman" w:hAnsi="Times New Roman"/>
@@ -653,16 +607,11 @@
         </w:rPr>
         <w:t xml:space="preserve">Ngày sinh: ${tenantDob}</w:t>
       </w:r>
-      <w:r>
-        <w:rPr>
-          <w:rFonts w:ascii="Times New Roman" w:cs="Times New Roman" w:eastAsia="Times New Roman" w:hAnsi="Times New Roman"/>
-          <w:sz w:val="25"/>
-          <w:szCs w:val="25"/>
-          <w:rtl w:val="0"/>
-        </w:rPr>
-        <w:t xml:space="preserve"/>
-      </w:r>
-      <w:r>
+    </w:p>
+    <w:p>
+      <w:pPr>
+        <w:shd w:fill="ffffff" w:val="clear"/>
+        <w:spacing w:after="0" w:line="240" w:lineRule="auto"/>
         <w:rPr>
           <w:rFonts w:ascii="Times New Roman" w:cs="Times New Roman" w:eastAsia="Times New Roman" w:hAnsi="Times New Roman"/>
           <w:b w:val="0"/>
@@ -670,29 +619,9 @@
           <w:color w:val="000000"/>
           <w:sz w:val="25"/>
           <w:szCs w:val="25"/>
-          <w:rtl w:val="0"/>
-        </w:rPr>
-        <w:t xml:space="preserve"/>
-      </w:r>
-      <w:r>
-        <w:rPr>
-          <w:rFonts w:ascii="Times New Roman" w:cs="Times New Roman" w:eastAsia="Times New Roman" w:hAnsi="Times New Roman"/>
-          <w:sz w:val="25"/>
-          <w:szCs w:val="25"/>
-          <w:rtl w:val="0"/>
-        </w:rPr>
-        <w:t xml:space="preserve"/>
-      </w:r>
-      <w:r>
-        <w:rPr>
-          <w:rtl w:val="0"/>
-        </w:rPr>
-      </w:r>
-    </w:p>
-    <w:p>
-      <w:pPr>
-        <w:shd w:fill="ffffff" w:val="clear"/>
-        <w:spacing w:after="0" w:line="240" w:lineRule="auto"/>
+        </w:rPr>
+      </w:pPr>
+      <w:r>
         <w:rPr>
           <w:rFonts w:ascii="Times New Roman" w:cs="Times New Roman" w:eastAsia="Times New Roman" w:hAnsi="Times New Roman"/>
           <w:b w:val="0"/>
@@ -700,9 +629,78 @@
           <w:color w:val="000000"/>
           <w:sz w:val="25"/>
           <w:szCs w:val="25"/>
-        </w:rPr>
-      </w:pPr>
-      <w:r>
+          <w:rtl w:val="0"/>
+        </w:rPr>
+        <w:t xml:space="preserve">HKTT: ${tenantAddress}</w:t>
+      </w:r>
+    </w:p>
+    <w:p>
+      <w:pPr>
+        <w:shd w:fill="ffffff" w:val="clear"/>
+        <w:spacing w:after="0" w:line="240" w:lineRule="auto"/>
+        <w:rPr>
+          <w:rFonts w:ascii="Times New Roman" w:cs="Times New Roman" w:eastAsia="Times New Roman" w:hAnsi="Times New Roman"/>
+          <w:color w:val="000000"/>
+          <w:sz w:val="25"/>
+          <w:szCs w:val="25"/>
+        </w:rPr>
+      </w:pPr>
+      <w:r>
+        <w:rPr>
+          <w:rFonts w:ascii="Times New Roman" w:cs="Times New Roman" w:eastAsia="Times New Roman" w:hAnsi="Times New Roman"/>
+          <w:color w:val="000000"/>
+          <w:sz w:val="25"/>
+          <w:szCs w:val="25"/>
+          <w:rtl w:val="0"/>
+        </w:rPr>
+        <w:t xml:space="preserve">Điện thoại: ${tenantPhone}</w:t>
+      </w:r>
+    </w:p>
+    <w:p>
+      <w:pPr>
+        <w:shd w:fill="ffffff" w:val="clear"/>
+        <w:spacing w:after="0" w:line="240" w:lineRule="auto"/>
+        <w:rPr>
+          <w:rFonts w:ascii="Times New Roman" w:cs="Times New Roman" w:eastAsia="Times New Roman" w:hAnsi="Times New Roman"/>
+          <w:color w:val="000000"/>
+          <w:sz w:val="25"/>
+          <w:szCs w:val="25"/>
+        </w:rPr>
+      </w:pPr>
+      <w:r>
+        <w:rPr>
+          <w:rFonts w:ascii="Times New Roman" w:cs="Times New Roman" w:eastAsia="Times New Roman" w:hAnsi="Times New Roman"/>
+          <w:color w:val="000000"/>
+          <w:sz w:val="25"/>
+          <w:szCs w:val="25"/>
+          <w:rtl w:val="0"/>
+        </w:rPr>
+        <w:t xml:space="preserve">Người ở cùng: ${householdMembers}</w:t>
+      </w:r>
+    </w:p>
+    <w:p>
+      <w:pPr>
+        <w:shd w:fill="ffffff" w:val="clear"/>
+        <w:spacing w:after="0" w:line="240" w:lineRule="auto"/>
+        <w:rPr>
+          <w:rFonts w:ascii="Times New Roman" w:cs="Times New Roman" w:eastAsia="Times New Roman" w:hAnsi="Times New Roman"/>
+          <w:b w:val="1"/>
+          <w:bCs w:val="1"/>
+          <w:color w:val="000000"/>
+          <w:sz w:val="25"/>
+          <w:szCs w:val="25"/>
+        </w:rPr>
+      </w:pPr>
+      <w:r>
+        <w:rPr>
+          <w:rtl w:val="0"/>
+        </w:rPr>
+      </w:r>
+    </w:p>
+    <w:p>
+      <w:pPr>
+        <w:shd w:fill="ffffff" w:val="clear"/>
+        <w:spacing w:after="0" w:line="240" w:lineRule="auto"/>
         <w:rPr>
           <w:rFonts w:ascii="Times New Roman" w:cs="Times New Roman" w:eastAsia="Times New Roman" w:hAnsi="Times New Roman"/>
           <w:b w:val="0"/>
@@ -710,122 +708,8 @@
           <w:color w:val="000000"/>
           <w:sz w:val="25"/>
           <w:szCs w:val="25"/>
-          <w:rtl w:val="0"/>
-        </w:rPr>
-        <w:t xml:space="preserve">HKTT: ${tenantAddress}</w:t>
-      </w:r>
-      <w:r>
-        <w:rPr>
-          <w:rFonts w:ascii="Times New Roman" w:cs="Times New Roman" w:eastAsia="Times New Roman" w:hAnsi="Times New Roman"/>
-          <w:sz w:val="25"/>
-          <w:szCs w:val="25"/>
-          <w:rtl w:val="0"/>
-        </w:rPr>
-        <w:t xml:space="preserve"/>
-      </w:r>
-      <w:r>
-        <w:rPr>
-          <w:rtl w:val="0"/>
-        </w:rPr>
-      </w:r>
-    </w:p>
-    <w:p>
-      <w:pPr>
-        <w:shd w:fill="ffffff" w:val="clear"/>
-        <w:spacing w:after="0" w:line="240" w:lineRule="auto"/>
-        <w:rPr>
-          <w:rFonts w:ascii="Times New Roman" w:cs="Times New Roman" w:eastAsia="Times New Roman" w:hAnsi="Times New Roman"/>
-          <w:color w:val="000000"/>
-          <w:sz w:val="25"/>
-          <w:szCs w:val="25"/>
-        </w:rPr>
-      </w:pPr>
-      <w:r>
-        <w:rPr>
-          <w:rFonts w:ascii="Times New Roman" w:cs="Times New Roman" w:eastAsia="Times New Roman" w:hAnsi="Times New Roman"/>
-          <w:color w:val="000000"/>
-          <w:sz w:val="25"/>
-          <w:szCs w:val="25"/>
-          <w:rtl w:val="0"/>
-        </w:rPr>
-        <w:t xml:space="preserve">Điện thoại: ${tenantPhone}</w:t>
-      </w:r>
-    </w:p>
-    <w:p>
-      <w:pPr>
-        <w:shd w:fill="ffffff" w:val="clear"/>
-        <w:spacing w:after="0" w:line="240" w:lineRule="auto"/>
-        <w:rPr>
-          <w:rFonts w:ascii="Times New Roman" w:cs="Times New Roman" w:eastAsia="Times New Roman" w:hAnsi="Times New Roman"/>
-          <w:color w:val="000000"/>
-          <w:sz w:val="25"/>
-          <w:szCs w:val="25"/>
-        </w:rPr>
-      </w:pPr>
-      <w:r>
-        <w:rPr>
-          <w:rtl w:val="0"/>
-        </w:rPr>
-      </w:r>
-    </w:p>
-    <w:p>
-      <w:pPr>
-        <w:shd w:fill="ffffff" w:val="clear"/>
-        <w:spacing w:after="0" w:line="240" w:lineRule="auto"/>
-        <w:rPr>
-          <w:rFonts w:ascii="Times New Roman" w:cs="Times New Roman" w:eastAsia="Times New Roman" w:hAnsi="Times New Roman"/>
-          <w:color w:val="000000"/>
-          <w:sz w:val="25"/>
-          <w:szCs w:val="25"/>
-        </w:rPr>
-      </w:pPr>
-      <w:r>
-        <w:rPr>
-          <w:rFonts w:ascii="Times New Roman" w:cs="Times New Roman" w:eastAsia="Times New Roman" w:hAnsi="Times New Roman"/>
-          <w:color w:val="000000"/>
-          <w:sz w:val="25"/>
-          <w:szCs w:val="25"/>
-          <w:rtl w:val="0"/>
-        </w:rPr>
-        <w:t xml:space="preserve">Người ở cùng: ${householdMembers}</w:t>
-      </w:r>
-    </w:p>
-    <w:p>
-      <w:pPr>
-        <w:shd w:fill="ffffff" w:val="clear"/>
-        <w:spacing w:after="0" w:line="240" w:lineRule="auto"/>
-        <w:rPr>
-          <w:rFonts w:ascii="Times New Roman" w:cs="Times New Roman" w:eastAsia="Times New Roman" w:hAnsi="Times New Roman"/>
-          <w:b w:val="1"/>
-          <w:bCs w:val="1"/>
-          <w:color w:val="000000"/>
-          <w:sz w:val="25"/>
-          <w:szCs w:val="25"/>
-        </w:rPr>
-      </w:pPr>
-      <w:r>
-        <w:rPr>
-          <w:rFonts w:ascii="Times New Roman" w:cs="Times New Roman" w:eastAsia="Times New Roman" w:hAnsi="Times New Roman"/>
-          <w:b w:val="1"/>
-          <w:bCs w:val="1"/>
-          <w:color w:val="000000"/>
-          <w:sz w:val="25"/>
-          <w:szCs w:val="25"/>
-          <w:rtl w:val="0"/>
-        </w:rPr>
-        <w:t xml:space="preserve"/>
-      </w:r>
-      <w:r>
-        <w:rPr>
-          <w:rFonts w:ascii="Times New Roman" w:cs="Times New Roman" w:eastAsia="Times New Roman" w:hAnsi="Times New Roman"/>
-          <w:b w:val="1"/>
-          <w:bCs w:val="1"/>
-          <w:sz w:val="25"/>
-          <w:szCs w:val="25"/>
-          <w:rtl w:val="0"/>
-        </w:rPr>
-        <w:t xml:space="preserve"/>
-      </w:r>
+        </w:rPr>
+      </w:pPr>
       <w:r>
         <w:rPr>
           <w:rtl w:val="0"/>
@@ -847,120 +731,24 @@
       </w:pPr>
       <w:r>
         <w:rPr>
-          <w:rFonts w:ascii="Times New Roman" w:cs="Times New Roman" w:eastAsia="Times New Roman" w:hAnsi="Times New Roman"/>
-          <w:color w:val="000000"/>
-          <w:sz w:val="25"/>
-          <w:szCs w:val="25"/>
-          <w:rtl w:val="0"/>
-        </w:rPr>
-        <w:t xml:space="preserve"/>
-      </w:r>
-      <w:r>
-        <w:rPr>
-          <w:rFonts w:ascii="Times New Roman" w:cs="Times New Roman" w:eastAsia="Times New Roman" w:hAnsi="Times New Roman"/>
-          <w:b w:val="0"/>
-          <w:bCs w:val="0"/>
-          <w:color w:val="000000"/>
-          <w:sz w:val="25"/>
-          <w:szCs w:val="25"/>
-          <w:rtl w:val="0"/>
-        </w:rPr>
-        <w:t xml:space="preserve"/>
-      </w:r>
-      <w:r>
-        <w:rPr>
-          <w:rFonts w:ascii="Times New Roman" w:cs="Times New Roman" w:eastAsia="Times New Roman" w:hAnsi="Times New Roman"/>
-          <w:sz w:val="25"/>
-          <w:szCs w:val="25"/>
-          <w:rtl w:val="0"/>
-        </w:rPr>
-        <w:t xml:space="preserve"/>
-      </w:r>
-      <w:r>
-        <w:rPr>
-          <w:rFonts w:ascii="Times New Roman" w:cs="Times New Roman" w:eastAsia="Times New Roman" w:hAnsi="Times New Roman"/>
-          <w:b w:val="0"/>
-          <w:bCs w:val="0"/>
-          <w:color w:val="000000"/>
-          <w:sz w:val="25"/>
-          <w:szCs w:val="25"/>
-          <w:rtl w:val="0"/>
-        </w:rPr>
-        <w:t xml:space="preserve"/>
-      </w:r>
-      <w:r>
-        <w:rPr>
-          <w:rFonts w:ascii="Times New Roman" w:cs="Times New Roman" w:eastAsia="Times New Roman" w:hAnsi="Times New Roman"/>
-          <w:sz w:val="25"/>
-          <w:szCs w:val="25"/>
-          <w:rtl w:val="0"/>
-        </w:rPr>
-        <w:t xml:space="preserve"/>
-      </w:r>
-      <w:r>
-        <w:rPr>
-          <w:rtl w:val="0"/>
-        </w:rPr>
-      </w:r>
-    </w:p>
-    <w:p>
-      <w:pPr>
-        <w:shd w:fill="ffffff" w:val="clear"/>
-        <w:spacing w:after="0" w:line="240" w:lineRule="auto"/>
-        <w:rPr>
-          <w:rFonts w:ascii="Times New Roman" w:cs="Times New Roman" w:eastAsia="Times New Roman" w:hAnsi="Times New Roman"/>
-          <w:b w:val="0"/>
-          <w:bCs w:val="0"/>
-          <w:color w:val="000000"/>
-          <w:sz w:val="25"/>
-          <w:szCs w:val="25"/>
-        </w:rPr>
-      </w:pPr>
-      <w:r>
-        <w:rPr>
-          <w:rFonts w:ascii="Times New Roman" w:cs="Times New Roman" w:eastAsia="Times New Roman" w:hAnsi="Times New Roman"/>
-          <w:b w:val="0"/>
-          <w:bCs w:val="0"/>
-          <w:color w:val="000000"/>
-          <w:sz w:val="25"/>
-          <w:szCs w:val="25"/>
-          <w:rtl w:val="0"/>
-        </w:rPr>
-        <w:t xml:space="preserve"/>
-      </w:r>
-      <w:r>
-        <w:rPr>
-          <w:rFonts w:ascii="Times New Roman" w:cs="Times New Roman" w:eastAsia="Times New Roman" w:hAnsi="Times New Roman"/>
-          <w:sz w:val="25"/>
-          <w:szCs w:val="25"/>
-          <w:rtl w:val="0"/>
-        </w:rPr>
-        <w:t xml:space="preserve"/>
-      </w:r>
-      <w:r>
-        <w:rPr>
-          <w:rtl w:val="0"/>
-        </w:rPr>
-      </w:r>
-    </w:p>
-    <w:p>
-      <w:pPr>
-        <w:shd w:fill="ffffff" w:val="clear"/>
-        <w:spacing w:after="0" w:line="240" w:lineRule="auto"/>
-        <w:rPr>
-          <w:rFonts w:ascii="Times New Roman" w:cs="Times New Roman" w:eastAsia="Times New Roman" w:hAnsi="Times New Roman"/>
-          <w:sz w:val="25"/>
-          <w:szCs w:val="25"/>
-        </w:rPr>
-      </w:pPr>
-      <w:r>
-        <w:rPr>
-          <w:rFonts w:ascii="Times New Roman" w:cs="Times New Roman" w:eastAsia="Times New Roman" w:hAnsi="Times New Roman"/>
-          <w:sz w:val="25"/>
-          <w:szCs w:val="25"/>
-          <w:rtl w:val="0"/>
-        </w:rPr>
-        <w:t xml:space="preserve"/>
+          <w:rtl w:val="0"/>
+        </w:rPr>
+      </w:r>
+    </w:p>
+    <w:p>
+      <w:pPr>
+        <w:shd w:fill="ffffff" w:val="clear"/>
+        <w:spacing w:after="0" w:line="240" w:lineRule="auto"/>
+        <w:rPr>
+          <w:rFonts w:ascii="Times New Roman" w:cs="Times New Roman" w:eastAsia="Times New Roman" w:hAnsi="Times New Roman"/>
+          <w:sz w:val="25"/>
+          <w:szCs w:val="25"/>
+        </w:rPr>
+      </w:pPr>
+      <w:r>
+        <w:rPr>
+          <w:rtl w:val="0"/>
+        </w:rPr>
       </w:r>
     </w:p>
     <w:p>
@@ -1129,15 +917,6 @@
       </w:r>
       <w:r>
         <w:rPr>
-          <w:rFonts w:ascii="Times New Roman" w:cs="Times New Roman" w:eastAsia="Times New Roman" w:hAnsi="Times New Roman"/>
-          <w:sz w:val="25"/>
-          <w:szCs w:val="25"/>
-          <w:rtl w:val="0"/>
-        </w:rPr>
-        <w:t xml:space="preserve"/>
-      </w:r>
-      <w:r>
-        <w:rPr>
           <w:rtl w:val="0"/>
         </w:rPr>
       </w:r>
@@ -1199,273 +978,621 @@
       </w:r>
       <w:r>
         <w:rPr>
+          <w:rtl w:val="0"/>
+        </w:rPr>
+      </w:r>
+    </w:p>
+    <w:p>
+      <w:pPr>
+        <w:shd w:fill="ffffff" w:val="clear"/>
+        <w:spacing w:after="0" w:line="240" w:lineRule="auto"/>
+        <w:ind w:left="360" w:firstLine="0"/>
+        <w:jc w:val="both"/>
+        <w:rPr>
+          <w:rFonts w:ascii="Times New Roman" w:cs="Times New Roman" w:eastAsia="Times New Roman" w:hAnsi="Times New Roman"/>
+          <w:color w:val="000000"/>
+          <w:sz w:val="25"/>
+          <w:szCs w:val="25"/>
+        </w:rPr>
+      </w:pPr>
+      <w:r>
+        <w:rPr>
+          <w:rtl w:val="0"/>
+        </w:rPr>
+      </w:r>
+    </w:p>
+    <w:p>
+      <w:pPr>
+        <w:shd w:fill="ffffff" w:val="clear"/>
+        <w:spacing w:after="0" w:line="240" w:lineRule="auto"/>
+        <w:jc w:val="both"/>
+        <w:rPr>
+          <w:rFonts w:ascii="Times New Roman" w:cs="Times New Roman" w:eastAsia="Times New Roman" w:hAnsi="Times New Roman"/>
+          <w:color w:val="000000"/>
+          <w:sz w:val="25"/>
+          <w:szCs w:val="25"/>
+        </w:rPr>
+      </w:pPr>
+      <w:r>
+        <w:rPr>
+          <w:rFonts w:ascii="Times New Roman" w:cs="Times New Roman" w:eastAsia="Times New Roman" w:hAnsi="Times New Roman"/>
+          <w:b w:val="1"/>
+          <w:bCs w:val="1"/>
+          <w:color w:val="000000"/>
+          <w:sz w:val="25"/>
+          <w:szCs w:val="25"/>
+          <w:u w:val="single"/>
+          <w:rtl w:val="0"/>
+        </w:rPr>
+        <w:t xml:space="preserve">Điều 2</w:t>
+      </w:r>
+      <w:r>
+        <w:rPr>
+          <w:rFonts w:ascii="Times New Roman" w:cs="Times New Roman" w:eastAsia="Times New Roman" w:hAnsi="Times New Roman"/>
+          <w:b w:val="1"/>
+          <w:bCs w:val="1"/>
+          <w:color w:val="000000"/>
+          <w:sz w:val="25"/>
+          <w:szCs w:val="25"/>
+          <w:rtl w:val="0"/>
+        </w:rPr>
+        <w:t xml:space="preserve">: Mục đích thuê</w:t>
+      </w:r>
+      <w:r>
+        <w:rPr>
+          <w:rtl w:val="0"/>
+        </w:rPr>
+      </w:r>
+    </w:p>
+    <w:p>
+      <w:pPr>
+        <w:shd w:fill="ffffff" w:val="clear"/>
+        <w:spacing w:after="150" w:line="240" w:lineRule="auto"/>
+        <w:jc w:val="both"/>
+        <w:rPr>
+          <w:rFonts w:ascii="Times New Roman" w:cs="Times New Roman" w:eastAsia="Times New Roman" w:hAnsi="Times New Roman"/>
+          <w:color w:val="000000"/>
+          <w:sz w:val="25"/>
+          <w:szCs w:val="25"/>
+        </w:rPr>
+      </w:pPr>
+      <w:r>
+        <w:rPr>
+          <w:rFonts w:ascii="Times New Roman" w:cs="Times New Roman" w:eastAsia="Times New Roman" w:hAnsi="Times New Roman"/>
+          <w:color w:val="000000"/>
+          <w:sz w:val="25"/>
+          <w:szCs w:val="25"/>
+          <w:rtl w:val="0"/>
+        </w:rPr>
+        <w:t xml:space="preserve">Mục đích thuê: Để ở</w:t>
+      </w:r>
+    </w:p>
+    <w:p>
+      <w:pPr>
+        <w:shd w:fill="ffffff" w:val="clear"/>
+        <w:spacing w:after="150" w:line="240" w:lineRule="auto"/>
+        <w:jc w:val="both"/>
+        <w:rPr>
+          <w:rFonts w:ascii="Times New Roman" w:cs="Times New Roman" w:eastAsia="Times New Roman" w:hAnsi="Times New Roman"/>
+          <w:color w:val="000000"/>
+          <w:sz w:val="25"/>
+          <w:szCs w:val="25"/>
+        </w:rPr>
+      </w:pPr>
+      <w:r>
+        <w:rPr>
+          <w:rFonts w:ascii="Times New Roman" w:cs="Times New Roman" w:eastAsia="Times New Roman" w:hAnsi="Times New Roman"/>
+          <w:b w:val="1"/>
+          <w:bCs w:val="1"/>
+          <w:color w:val="000000"/>
+          <w:sz w:val="25"/>
+          <w:szCs w:val="25"/>
+          <w:u w:val="single"/>
+          <w:rtl w:val="0"/>
+        </w:rPr>
+        <w:t xml:space="preserve">Điều 3: Thời hạn thuê ${leaseDurationMonths} tháng, từ ngày ${startDate} đến ngày ${endDate}</w:t>
+      </w:r>
+      <w:r>
+        <w:rPr>
+          <w:rtl w:val="0"/>
+        </w:rPr>
+      </w:r>
+    </w:p>
+    <w:p>
+      <w:pPr>
+        <w:shd w:fill="ffffff" w:val="clear"/>
+        <w:spacing w:after="0" w:line="240" w:lineRule="auto"/>
+        <w:jc w:val="both"/>
+        <w:rPr>
+          <w:rFonts w:ascii="Times New Roman" w:cs="Times New Roman" w:eastAsia="Times New Roman" w:hAnsi="Times New Roman"/>
+          <w:color w:val="000000"/>
+          <w:sz w:val="25"/>
+          <w:szCs w:val="25"/>
+        </w:rPr>
+      </w:pPr>
+      <w:r>
+        <w:rPr>
+          <w:rFonts w:ascii="Times New Roman" w:cs="Times New Roman" w:eastAsia="Times New Roman" w:hAnsi="Times New Roman"/>
+          <w:b w:val="1"/>
+          <w:bCs w:val="1"/>
+          <w:color w:val="000000"/>
+          <w:sz w:val="25"/>
+          <w:szCs w:val="25"/>
+          <w:u w:val="single"/>
+          <w:rtl w:val="0"/>
+        </w:rPr>
+        <w:t xml:space="preserve">Điều 4</w:t>
+      </w:r>
+      <w:r>
+        <w:rPr>
+          <w:rFonts w:ascii="Times New Roman" w:cs="Times New Roman" w:eastAsia="Times New Roman" w:hAnsi="Times New Roman"/>
+          <w:b w:val="1"/>
+          <w:bCs w:val="1"/>
+          <w:color w:val="000000"/>
+          <w:sz w:val="25"/>
+          <w:szCs w:val="25"/>
+          <w:rtl w:val="0"/>
+        </w:rPr>
+        <w:t xml:space="preserve">: Giá thuê</w:t>
+      </w:r>
+      <w:r>
+        <w:rPr>
+          <w:rtl w:val="0"/>
+        </w:rPr>
+      </w:r>
+    </w:p>
+    <w:p>
+      <w:pPr>
+        <w:shd w:fill="ffffff" w:val="clear"/>
+        <w:spacing w:after="0" w:line="240" w:lineRule="auto"/>
+        <w:jc w:val="both"/>
+        <w:rPr>
+          <w:rFonts w:ascii="Times New Roman" w:cs="Times New Roman" w:eastAsia="Times New Roman" w:hAnsi="Times New Roman"/>
+          <w:i w:val="1"/>
+          <w:iCs w:val="1"/>
+          <w:color w:val="000000"/>
+          <w:sz w:val="25"/>
+          <w:szCs w:val="25"/>
+        </w:rPr>
+      </w:pPr>
+      <w:r>
+        <w:rPr>
+          <w:rFonts w:ascii="Times New Roman" w:cs="Times New Roman" w:eastAsia="Times New Roman" w:hAnsi="Times New Roman"/>
+          <w:color w:val="000000"/>
+          <w:sz w:val="25"/>
+          <w:szCs w:val="25"/>
+          <w:rtl w:val="0"/>
+        </w:rPr>
+        <w:t xml:space="preserve">4.1. Tiền thuê nhà mỗi tháng là: ${rentAmount} VND (Bằng chữ: ${rentAmountInWords})</w:t>
+      </w:r>
+      <w:r>
+        <w:rPr>
+          <w:rtl w:val="0"/>
+        </w:rPr>
+      </w:r>
+    </w:p>
+    <w:p>
+      <w:pPr>
+        <w:shd w:fill="ffffff" w:val="clear"/>
+        <w:spacing w:after="0" w:line="240" w:lineRule="auto"/>
+        <w:jc w:val="both"/>
+        <w:rPr>
+          <w:rFonts w:ascii="Times New Roman" w:cs="Times New Roman" w:eastAsia="Times New Roman" w:hAnsi="Times New Roman"/>
+          <w:b w:val="1"/>
+          <w:bCs w:val="1"/>
+          <w:color w:val="000000"/>
+          <w:sz w:val="25"/>
+          <w:szCs w:val="25"/>
+        </w:rPr>
+      </w:pPr>
+      <w:r>
+        <w:rPr>
+          <w:rFonts w:ascii="Times New Roman" w:cs="Times New Roman" w:eastAsia="Times New Roman" w:hAnsi="Times New Roman"/>
+          <w:color w:val="000000"/>
+          <w:sz w:val="25"/>
+          <w:szCs w:val="25"/>
+          <w:rtl w:val="0"/>
+        </w:rPr>
+        <w:t xml:space="preserve">4.2. Tiền thuê nhà nêu trên sẽ cố định trong thời hạn hợp đồng.</w:t>
+      </w:r>
+      <w:r>
+        <w:rPr>
+          <w:rtl w:val="0"/>
+        </w:rPr>
+      </w:r>
+    </w:p>
+    <w:p>
+      <w:pPr>
+        <w:shd w:fill="ffffff" w:val="clear"/>
+        <w:spacing w:after="150" w:line="240" w:lineRule="auto"/>
+        <w:jc w:val="both"/>
+        <w:rPr>
+          <w:rFonts w:ascii="Times New Roman" w:cs="Times New Roman" w:eastAsia="Times New Roman" w:hAnsi="Times New Roman"/>
+          <w:color w:val="000000"/>
+          <w:sz w:val="25"/>
+          <w:szCs w:val="25"/>
+        </w:rPr>
+      </w:pPr>
+      <w:r>
+        <w:rPr>
+          <w:rFonts w:ascii="Times New Roman" w:cs="Times New Roman" w:eastAsia="Times New Roman" w:hAnsi="Times New Roman"/>
+          <w:color w:val="000000"/>
+          <w:sz w:val="25"/>
+          <w:szCs w:val="25"/>
+          <w:rtl w:val="0"/>
+        </w:rPr>
+        <w:t xml:space="preserve">4.3. Tiền thuê nhà hàng tháng nêu trên không bao gồm các chi phí sử dụng cơ sở hạ tầng như: Phí dịch vụ quản lý tòa nhà và các dịch vụ khác: Điện, nước, điện thoại, truyền hình cáp, internet. Những chi phí này do bên B sử dụng sẽ do bên B tự thanh toán trực tiếp với nhà cung cấp dịch vụ theo đúng thời gian quy định dựa trên khối lượng tiêu thụ hàng tháng của bên B.</w:t>
+      </w:r>
+    </w:p>
+    <w:p>
+      <w:pPr>
+        <w:shd w:fill="ffffff" w:val="clear"/>
+        <w:spacing w:after="0" w:line="240" w:lineRule="auto"/>
+        <w:jc w:val="both"/>
+        <w:rPr>
+          <w:rFonts w:ascii="Times New Roman" w:cs="Times New Roman" w:eastAsia="Times New Roman" w:hAnsi="Times New Roman"/>
+          <w:color w:val="000000"/>
+          <w:sz w:val="25"/>
+          <w:szCs w:val="25"/>
+        </w:rPr>
+      </w:pPr>
+      <w:r>
+        <w:rPr>
+          <w:rFonts w:ascii="Times New Roman" w:cs="Times New Roman" w:eastAsia="Times New Roman" w:hAnsi="Times New Roman"/>
+          <w:b w:val="1"/>
+          <w:bCs w:val="1"/>
+          <w:color w:val="000000"/>
+          <w:sz w:val="25"/>
+          <w:szCs w:val="25"/>
+          <w:u w:val="single"/>
+          <w:rtl w:val="0"/>
+        </w:rPr>
+        <w:t xml:space="preserve">Điều 5</w:t>
+      </w:r>
+      <w:r>
+        <w:rPr>
+          <w:rFonts w:ascii="Times New Roman" w:cs="Times New Roman" w:eastAsia="Times New Roman" w:hAnsi="Times New Roman"/>
+          <w:b w:val="1"/>
+          <w:bCs w:val="1"/>
+          <w:color w:val="000000"/>
+          <w:sz w:val="25"/>
+          <w:szCs w:val="25"/>
+          <w:rtl w:val="0"/>
+        </w:rPr>
+        <w:t xml:space="preserve">: Đặt cọc và phương thức thanh toán</w:t>
+      </w:r>
+      <w:r>
+        <w:rPr>
+          <w:rtl w:val="0"/>
+        </w:rPr>
+      </w:r>
+    </w:p>
+    <w:p>
+      <w:pPr>
+        <w:shd w:fill="ffffff" w:val="clear"/>
+        <w:spacing w:after="0" w:line="240" w:lineRule="auto"/>
+        <w:jc w:val="both"/>
+        <w:rPr>
+          <w:rFonts w:ascii="Times New Roman" w:cs="Times New Roman" w:eastAsia="Times New Roman" w:hAnsi="Times New Roman"/>
+          <w:b w:val="1"/>
+          <w:bCs w:val="1"/>
+          <w:sz w:val="25"/>
+          <w:szCs w:val="25"/>
+        </w:rPr>
+      </w:pPr>
+      <w:r>
+        <w:rPr>
+          <w:rFonts w:ascii="Times New Roman" w:cs="Times New Roman" w:eastAsia="Times New Roman" w:hAnsi="Times New Roman"/>
+          <w:color w:val="000000"/>
+          <w:sz w:val="25"/>
+          <w:szCs w:val="25"/>
+          <w:rtl w:val="0"/>
+        </w:rPr>
+        <w:t xml:space="preserve">5.1 Đặt cọc: Bên B đặt cọc cho bên A một khoản tiền là: ${deposit} VND (Bằng chữ: ${depositInWords})</w:t>
+      </w:r>
+      <w:r>
+        <w:rPr>
+          <w:rtl w:val="0"/>
+        </w:rPr>
+      </w:r>
+    </w:p>
+    <w:p>
+      <w:pPr>
+        <w:shd w:fill="ffffff" w:val="clear"/>
+        <w:spacing w:after="0" w:line="240" w:lineRule="auto"/>
+        <w:jc w:val="both"/>
+        <w:rPr>
+          <w:rFonts w:ascii="Times New Roman" w:cs="Times New Roman" w:eastAsia="Times New Roman" w:hAnsi="Times New Roman"/>
+          <w:b w:val="1"/>
+          <w:bCs w:val="1"/>
+          <w:color w:val="000000"/>
+          <w:sz w:val="25"/>
+          <w:szCs w:val="25"/>
+        </w:rPr>
+      </w:pPr>
+      <w:r>
+        <w:rPr>
+          <w:rtl w:val="0"/>
+        </w:rPr>
+      </w:r>
+    </w:p>
+    <w:p>
+      <w:pPr>
+        <w:shd w:fill="ffffff" w:val="clear"/>
+        <w:spacing w:after="150" w:line="240" w:lineRule="auto"/>
+        <w:jc w:val="both"/>
+        <w:rPr>
+          <w:rFonts w:ascii="Times New Roman" w:cs="Times New Roman" w:eastAsia="Times New Roman" w:hAnsi="Times New Roman"/>
+          <w:color w:val="000000"/>
+          <w:sz w:val="25"/>
+          <w:szCs w:val="25"/>
+        </w:rPr>
+      </w:pPr>
+      <w:r>
+        <w:rPr>
+          <w:rFonts w:ascii="Times New Roman" w:cs="Times New Roman" w:eastAsia="Times New Roman" w:hAnsi="Times New Roman"/>
+          <w:color w:val="000000"/>
+          <w:sz w:val="25"/>
+          <w:szCs w:val="25"/>
+          <w:rtl w:val="0"/>
+        </w:rPr>
+        <w:t xml:space="preserve">Số tiền đặt cọc này sẽ được trả lại cho Bên B sau khi hợp đồng kết thúc và khi bên B đã thanh toán hết các chi phí sử dụng dịch vụ (được nêu trong khoản 4.3 điều 4) cũng như chi phí bồi thường các hư hỏng, mất mát đối với căn hộ và thiết bị do mình gây ra nếu có.</w:t>
+      </w:r>
+    </w:p>
+    <w:p>
+      <w:pPr>
+        <w:shd w:fill="ffffff" w:val="clear"/>
+        <w:spacing w:after="150" w:line="240" w:lineRule="auto"/>
+        <w:jc w:val="both"/>
+        <w:rPr>
+          <w:rFonts w:ascii="Times New Roman" w:cs="Times New Roman" w:eastAsia="Times New Roman" w:hAnsi="Times New Roman"/>
+          <w:color w:val="000000"/>
+          <w:sz w:val="25"/>
+          <w:szCs w:val="25"/>
+        </w:rPr>
+      </w:pPr>
+      <w:r>
+        <w:rPr>
+          <w:rFonts w:ascii="Times New Roman" w:cs="Times New Roman" w:eastAsia="Times New Roman" w:hAnsi="Times New Roman"/>
+          <w:color w:val="000000"/>
+          <w:sz w:val="25"/>
+          <w:szCs w:val="25"/>
+          <w:rtl w:val="0"/>
+        </w:rPr>
+        <w:t xml:space="preserve">5.2 Hình thức thanh toán: Bằng tiền mặt hoặc bằng chuyển khoản theo số tài khoản:</w:t>
+      </w:r>
+    </w:p>
+    <w:p>
+      <w:pPr>
+        <w:shd w:fill="ffffff" w:val="clear"/>
+        <w:spacing w:after="0" w:line="240" w:lineRule="auto"/>
+        <w:rPr>
           <w:rFonts w:ascii="Times New Roman" w:cs="Times New Roman" w:eastAsia="Times New Roman" w:hAnsi="Times New Roman"/>
           <w:b w:val="0"/>
           <w:bCs w:val="0"/>
-          <w:i w:val="0"/>
-          <w:iCs w:val="0"/>
-          <w:smallCaps w:val="0"/>
-          <w:strike w:val="0"/>
-          <w:color w:val="000000"/>
-          <w:sz w:val="25"/>
-          <w:szCs w:val="25"/>
-          <w:u w:val="none"/>
-          <w:shd w:fill="auto" w:val="clear"/>
-          <w:vertAlign w:val="baseline"/>
-          <w:rtl w:val="0"/>
-        </w:rPr>
-        <w:t xml:space="preserve"/>
-      </w:r>
-      <w:r>
-        <w:rPr>
-          <w:rFonts w:ascii="Times New Roman" w:cs="Times New Roman" w:eastAsia="Times New Roman" w:hAnsi="Times New Roman"/>
-          <w:sz w:val="25"/>
-          <w:szCs w:val="25"/>
-          <w:rtl w:val="0"/>
-        </w:rPr>
-        <w:t xml:space="preserve"/>
-      </w:r>
-      <w:r>
-        <w:rPr>
-          <w:rtl w:val="0"/>
-        </w:rPr>
-      </w:r>
-    </w:p>
-    <w:p>
-      <w:pPr>
-        <w:shd w:fill="ffffff" w:val="clear"/>
-        <w:spacing w:after="0" w:line="240" w:lineRule="auto"/>
-        <w:ind w:left="360" w:firstLine="0"/>
-        <w:jc w:val="both"/>
-        <w:rPr>
-          <w:rFonts w:ascii="Times New Roman" w:cs="Times New Roman" w:eastAsia="Times New Roman" w:hAnsi="Times New Roman"/>
-          <w:color w:val="000000"/>
-          <w:sz w:val="25"/>
-          <w:szCs w:val="25"/>
-        </w:rPr>
-      </w:pPr>
-      <w:r>
-        <w:rPr>
-          <w:rtl w:val="0"/>
-        </w:rPr>
-      </w:r>
-    </w:p>
-    <w:p>
-      <w:pPr>
-        <w:shd w:fill="ffffff" w:val="clear"/>
-        <w:spacing w:after="0" w:line="240" w:lineRule="auto"/>
-        <w:jc w:val="both"/>
-        <w:rPr>
-          <w:rFonts w:ascii="Times New Roman" w:cs="Times New Roman" w:eastAsia="Times New Roman" w:hAnsi="Times New Roman"/>
-          <w:color w:val="000000"/>
-          <w:sz w:val="25"/>
-          <w:szCs w:val="25"/>
-        </w:rPr>
-      </w:pPr>
-      <w:r>
-        <w:rPr>
-          <w:rFonts w:ascii="Times New Roman" w:cs="Times New Roman" w:eastAsia="Times New Roman" w:hAnsi="Times New Roman"/>
-          <w:b w:val="1"/>
-          <w:bCs w:val="1"/>
-          <w:color w:val="000000"/>
-          <w:sz w:val="25"/>
-          <w:szCs w:val="25"/>
-          <w:u w:val="single"/>
-          <w:rtl w:val="0"/>
-        </w:rPr>
-        <w:t xml:space="preserve">Điều 2</w:t>
-      </w:r>
-      <w:r>
-        <w:rPr>
-          <w:rFonts w:ascii="Times New Roman" w:cs="Times New Roman" w:eastAsia="Times New Roman" w:hAnsi="Times New Roman"/>
-          <w:b w:val="1"/>
-          <w:bCs w:val="1"/>
-          <w:color w:val="000000"/>
-          <w:sz w:val="25"/>
-          <w:szCs w:val="25"/>
-          <w:rtl w:val="0"/>
-        </w:rPr>
-        <w:t xml:space="preserve">: Mục đích thuê</w:t>
-      </w:r>
-      <w:r>
-        <w:rPr>
-          <w:rtl w:val="0"/>
-        </w:rPr>
-      </w:r>
-    </w:p>
-    <w:p>
-      <w:pPr>
-        <w:shd w:fill="ffffff" w:val="clear"/>
-        <w:spacing w:after="150" w:line="240" w:lineRule="auto"/>
-        <w:jc w:val="both"/>
-        <w:rPr>
-          <w:rFonts w:ascii="Times New Roman" w:cs="Times New Roman" w:eastAsia="Times New Roman" w:hAnsi="Times New Roman"/>
-          <w:color w:val="000000"/>
-          <w:sz w:val="25"/>
-          <w:szCs w:val="25"/>
-        </w:rPr>
-      </w:pPr>
-      <w:r>
-        <w:rPr>
-          <w:rFonts w:ascii="Times New Roman" w:cs="Times New Roman" w:eastAsia="Times New Roman" w:hAnsi="Times New Roman"/>
-          <w:color w:val="000000"/>
-          <w:sz w:val="25"/>
-          <w:szCs w:val="25"/>
-          <w:rtl w:val="0"/>
-        </w:rPr>
-        <w:t xml:space="preserve">Mục đích thuê: Để ở</w:t>
-      </w:r>
-    </w:p>
-    <w:p>
-      <w:pPr>
-        <w:shd w:fill="ffffff" w:val="clear"/>
-        <w:spacing w:after="150" w:line="240" w:lineRule="auto"/>
-        <w:jc w:val="both"/>
-        <w:rPr>
-          <w:rFonts w:ascii="Times New Roman" w:cs="Times New Roman" w:eastAsia="Times New Roman" w:hAnsi="Times New Roman"/>
-          <w:color w:val="000000"/>
-          <w:sz w:val="25"/>
-          <w:szCs w:val="25"/>
-        </w:rPr>
-      </w:pPr>
-      <w:r>
-        <w:rPr>
-          <w:rFonts w:ascii="Times New Roman" w:cs="Times New Roman" w:eastAsia="Times New Roman" w:hAnsi="Times New Roman"/>
-          <w:b w:val="1"/>
-          <w:bCs w:val="1"/>
-          <w:color w:val="000000"/>
-          <w:sz w:val="25"/>
-          <w:szCs w:val="25"/>
-          <w:u w:val="single"/>
-          <w:rtl w:val="0"/>
-        </w:rPr>
-        <w:t xml:space="preserve">Điều 3: Thời hạn thuê ${leaseDurationMonths} tháng, từ ngày ${startDate} đến ngày ${endDate}</w:t>
-      </w:r>
-      <w:r>
-        <w:rPr>
-          <w:rFonts w:ascii="Times New Roman" w:cs="Times New Roman" w:eastAsia="Times New Roman" w:hAnsi="Times New Roman"/>
-          <w:b w:val="1"/>
-          <w:bCs w:val="1"/>
-          <w:color w:val="000000"/>
-          <w:sz w:val="25"/>
-          <w:szCs w:val="25"/>
-          <w:rtl w:val="0"/>
-        </w:rPr>
-        <w:t xml:space="preserve"/>
-      </w:r>
-      <w:r>
-        <w:rPr>
-          <w:rFonts w:ascii="Times New Roman" w:cs="Times New Roman" w:eastAsia="Times New Roman" w:hAnsi="Times New Roman"/>
-          <w:color w:val="000000"/>
-          <w:sz w:val="25"/>
-          <w:szCs w:val="25"/>
-          <w:rtl w:val="0"/>
-        </w:rPr>
-        <w:t xml:space="preserve"/>
-      </w:r>
-      <w:r>
-        <w:rPr>
-          <w:rFonts w:ascii="Times New Roman" w:cs="Times New Roman" w:eastAsia="Times New Roman" w:hAnsi="Times New Roman"/>
-          <w:sz w:val="25"/>
-          <w:szCs w:val="25"/>
-          <w:rtl w:val="0"/>
-        </w:rPr>
-        <w:t xml:space="preserve"/>
-      </w:r>
-      <w:r>
-        <w:rPr>
-          <w:rFonts w:ascii="Times New Roman" w:cs="Times New Roman" w:eastAsia="Times New Roman" w:hAnsi="Times New Roman"/>
-          <w:color w:val="000000"/>
-          <w:sz w:val="25"/>
-          <w:szCs w:val="25"/>
-          <w:rtl w:val="0"/>
-        </w:rPr>
-        <w:t xml:space="preserve"/>
-      </w:r>
-      <w:r>
-        <w:rPr>
-          <w:rFonts w:ascii="Times New Roman" w:cs="Times New Roman" w:eastAsia="Times New Roman" w:hAnsi="Times New Roman"/>
-          <w:sz w:val="25"/>
-          <w:szCs w:val="25"/>
-          <w:rtl w:val="0"/>
-        </w:rPr>
-        <w:t xml:space="preserve"/>
-      </w:r>
-      <w:r>
-        <w:rPr>
-          <w:rFonts w:ascii="Times New Roman" w:cs="Times New Roman" w:eastAsia="Times New Roman" w:hAnsi="Times New Roman"/>
-          <w:color w:val="000000"/>
-          <w:sz w:val="25"/>
-          <w:szCs w:val="25"/>
-          <w:rtl w:val="0"/>
-        </w:rPr>
-        <w:t xml:space="preserve"/>
-      </w:r>
-      <w:r>
-        <w:rPr>
-          <w:rFonts w:ascii="Times New Roman" w:cs="Times New Roman" w:eastAsia="Times New Roman" w:hAnsi="Times New Roman"/>
-          <w:sz w:val="25"/>
-          <w:szCs w:val="25"/>
-          <w:rtl w:val="0"/>
-        </w:rPr>
-        <w:t xml:space="preserve"/>
-      </w:r>
-      <w:r>
-        <w:rPr>
-          <w:rtl w:val="0"/>
-        </w:rPr>
-      </w:r>
-    </w:p>
-    <w:p>
-      <w:pPr>
-        <w:shd w:fill="ffffff" w:val="clear"/>
-        <w:spacing w:after="0" w:line="240" w:lineRule="auto"/>
-        <w:jc w:val="both"/>
-        <w:rPr>
-          <w:rFonts w:ascii="Times New Roman" w:cs="Times New Roman" w:eastAsia="Times New Roman" w:hAnsi="Times New Roman"/>
-          <w:color w:val="000000"/>
-          <w:sz w:val="25"/>
-          <w:szCs w:val="25"/>
-        </w:rPr>
-      </w:pPr>
-      <w:r>
-        <w:rPr>
-          <w:rFonts w:ascii="Times New Roman" w:cs="Times New Roman" w:eastAsia="Times New Roman" w:hAnsi="Times New Roman"/>
-          <w:b w:val="1"/>
-          <w:bCs w:val="1"/>
-          <w:color w:val="000000"/>
-          <w:sz w:val="25"/>
-          <w:szCs w:val="25"/>
-          <w:u w:val="single"/>
-          <w:rtl w:val="0"/>
-        </w:rPr>
-        <w:t xml:space="preserve">Điều 4</w:t>
-      </w:r>
-      <w:r>
-        <w:rPr>
-          <w:rFonts w:ascii="Times New Roman" w:cs="Times New Roman" w:eastAsia="Times New Roman" w:hAnsi="Times New Roman"/>
-          <w:b w:val="1"/>
-          <w:bCs w:val="1"/>
-          <w:color w:val="000000"/>
-          <w:sz w:val="25"/>
-          <w:szCs w:val="25"/>
-          <w:rtl w:val="0"/>
-        </w:rPr>
-        <w:t xml:space="preserve">: Giá thuê</w:t>
-      </w:r>
-      <w:r>
-        <w:rPr>
-          <w:rtl w:val="0"/>
-        </w:rPr>
-      </w:r>
-    </w:p>
-    <w:p>
-      <w:pPr>
-        <w:shd w:fill="ffffff" w:val="clear"/>
-        <w:spacing w:after="0" w:line="240" w:lineRule="auto"/>
-        <w:jc w:val="both"/>
-        <w:rPr>
-          <w:rFonts w:ascii="Times New Roman" w:cs="Times New Roman" w:eastAsia="Times New Roman" w:hAnsi="Times New Roman"/>
+          <w:color w:val="000000"/>
+          <w:sz w:val="25"/>
+          <w:szCs w:val="25"/>
+        </w:rPr>
+      </w:pPr>
+      <w:r>
+        <w:rPr>
+          <w:rFonts w:ascii="Times New Roman" w:cs="Times New Roman" w:eastAsia="Times New Roman" w:hAnsi="Times New Roman"/>
+          <w:b w:val="0"/>
+          <w:bCs w:val="0"/>
+          <w:color w:val="000000"/>
+          <w:sz w:val="25"/>
+          <w:szCs w:val="25"/>
+          <w:rtl w:val="0"/>
+        </w:rPr>
+        <w:t xml:space="preserve">Số tài khoản: </w:t>
+      </w:r>
+    </w:p>
+    <w:p>
+      <w:pPr>
+        <w:shd w:fill="ffffff" w:val="clear"/>
+        <w:spacing w:after="0" w:line="240" w:lineRule="auto"/>
+        <w:rPr>
+          <w:rFonts w:ascii="Times New Roman" w:cs="Times New Roman" w:eastAsia="Times New Roman" w:hAnsi="Times New Roman"/>
+          <w:b w:val="0"/>
+          <w:bCs w:val="0"/>
+          <w:color w:val="000000"/>
+          <w:sz w:val="25"/>
+          <w:szCs w:val="25"/>
+        </w:rPr>
+      </w:pPr>
+      <w:r>
+        <w:rPr>
+          <w:rFonts w:ascii="Times New Roman" w:cs="Times New Roman" w:eastAsia="Times New Roman" w:hAnsi="Times New Roman"/>
+          <w:b w:val="0"/>
+          <w:bCs w:val="0"/>
+          <w:color w:val="000000"/>
+          <w:sz w:val="25"/>
+          <w:szCs w:val="25"/>
+          <w:rtl w:val="0"/>
+        </w:rPr>
+        <w:t xml:space="preserve">Chủ tài khoản: </w:t>
+      </w:r>
+    </w:p>
+    <w:p>
+      <w:pPr>
+        <w:shd w:fill="ffffff" w:val="clear"/>
+        <w:spacing w:after="150" w:line="240" w:lineRule="auto"/>
+        <w:jc w:val="both"/>
+        <w:rPr>
+          <w:rFonts w:ascii="Times New Roman" w:cs="Times New Roman" w:eastAsia="Times New Roman" w:hAnsi="Times New Roman"/>
+          <w:b w:val="0"/>
+          <w:bCs w:val="0"/>
+          <w:color w:val="000000"/>
+          <w:sz w:val="25"/>
+          <w:szCs w:val="25"/>
+        </w:rPr>
+      </w:pPr>
+      <w:r>
+        <w:rPr>
+          <w:rFonts w:ascii="Times New Roman" w:cs="Times New Roman" w:eastAsia="Times New Roman" w:hAnsi="Times New Roman"/>
+          <w:b w:val="0"/>
+          <w:bCs w:val="0"/>
+          <w:color w:val="000000"/>
+          <w:sz w:val="25"/>
+          <w:szCs w:val="25"/>
+          <w:rtl w:val="0"/>
+        </w:rPr>
+        <w:t xml:space="preserve">Ngân hàng: </w:t>
+      </w:r>
+    </w:p>
+    <w:p>
+      <w:pPr>
+        <w:shd w:fill="ffffff" w:val="clear"/>
+        <w:spacing w:after="150" w:line="240" w:lineRule="auto"/>
+        <w:jc w:val="both"/>
+        <w:rPr>
+          <w:rFonts w:ascii="Times New Roman" w:cs="Times New Roman" w:eastAsia="Times New Roman" w:hAnsi="Times New Roman"/>
+          <w:b w:val="1"/>
+          <w:bCs w:val="1"/>
+          <w:color w:val="000000"/>
+          <w:sz w:val="25"/>
+          <w:szCs w:val="25"/>
+        </w:rPr>
+      </w:pPr>
+      <w:r>
+        <w:rPr>
+          <w:rtl w:val="0"/>
+        </w:rPr>
+      </w:r>
+    </w:p>
+    <w:p>
+      <w:pPr>
+        <w:shd w:fill="ffffff" w:val="clear"/>
+        <w:spacing w:after="150" w:line="240" w:lineRule="auto"/>
+        <w:jc w:val="both"/>
+        <w:rPr>
+          <w:rFonts w:ascii="Times New Roman" w:cs="Times New Roman" w:eastAsia="Times New Roman" w:hAnsi="Times New Roman"/>
+          <w:color w:val="000000"/>
+          <w:sz w:val="25"/>
+          <w:szCs w:val="25"/>
+        </w:rPr>
+      </w:pPr>
+      <w:r>
+        <w:rPr>
+          <w:rFonts w:ascii="Times New Roman" w:cs="Times New Roman" w:eastAsia="Times New Roman" w:hAnsi="Times New Roman"/>
+          <w:color w:val="000000"/>
+          <w:sz w:val="25"/>
+          <w:szCs w:val="25"/>
+          <w:rtl w:val="0"/>
+        </w:rPr>
+        <w:t xml:space="preserve">5.3. Đồng tiền thanh toán: Thanh toán bằng đồng tiền Việt Nam Đồng (VND).</w:t>
+      </w:r>
+    </w:p>
+    <w:p>
+      <w:pPr>
+        <w:shd w:fill="ffffff" w:val="clear"/>
+        <w:spacing w:after="150" w:line="240" w:lineRule="auto"/>
+        <w:jc w:val="both"/>
+        <w:rPr>
+          <w:rFonts w:ascii="Times New Roman" w:cs="Times New Roman" w:eastAsia="Times New Roman" w:hAnsi="Times New Roman"/>
+          <w:color w:val="000000"/>
+          <w:sz w:val="25"/>
+          <w:szCs w:val="25"/>
+        </w:rPr>
+      </w:pPr>
+      <w:r>
+        <w:rPr>
+          <w:rFonts w:ascii="Times New Roman" w:cs="Times New Roman" w:eastAsia="Times New Roman" w:hAnsi="Times New Roman"/>
+          <w:color w:val="000000"/>
+          <w:sz w:val="25"/>
+          <w:szCs w:val="25"/>
+          <w:rtl w:val="0"/>
+        </w:rPr>
+        <w:t xml:space="preserve">5.4 Thời gian thanh toán: Ngày 01-05 hàng tháng.</w:t>
+      </w:r>
+    </w:p>
+    <w:p>
+      <w:pPr>
+        <w:shd w:fill="ffffff" w:val="clear"/>
+        <w:spacing w:after="0" w:line="240" w:lineRule="auto"/>
+        <w:rPr>
+          <w:rFonts w:ascii="Times New Roman" w:cs="Times New Roman" w:eastAsia="Times New Roman" w:hAnsi="Times New Roman"/>
+          <w:b w:val="0"/>
+          <w:bCs w:val="0"/>
+          <w:color w:val="000000"/>
+          <w:sz w:val="25"/>
+          <w:szCs w:val="25"/>
+        </w:rPr>
+      </w:pPr>
+      <w:r>
+        <w:rPr>
+          <w:rFonts w:ascii="Times New Roman" w:cs="Times New Roman" w:eastAsia="Times New Roman" w:hAnsi="Times New Roman"/>
+          <w:color w:val="000000"/>
+          <w:sz w:val="25"/>
+          <w:szCs w:val="25"/>
+          <w:rtl w:val="0"/>
+        </w:rPr>
+        <w:t xml:space="preserve">Ngay khi ký kết hợp đồng, Bên B sẽ thanh toán thêm cho Bên A số tiền đặt cọc: ${deposit} VND</w:t>
+      </w:r>
+      <w:r>
+        <w:rPr>
+          <w:rtl w:val="0"/>
+        </w:rPr>
+      </w:r>
+    </w:p>
+    <w:p>
+      <w:pPr>
+        <w:shd w:fill="ffffff" w:val="clear"/>
+        <w:spacing w:after="0" w:line="240" w:lineRule="auto"/>
+        <w:jc w:val="both"/>
+        <w:rPr>
+          <w:rFonts w:ascii="Times New Roman" w:cs="Times New Roman" w:eastAsia="Times New Roman" w:hAnsi="Times New Roman"/>
+          <w:b w:val="1"/>
+          <w:bCs w:val="1"/>
+          <w:sz w:val="25"/>
+          <w:szCs w:val="25"/>
+        </w:rPr>
+      </w:pPr>
+      <w:r>
+        <w:rPr>
+          <w:rFonts w:ascii="Times New Roman" w:cs="Times New Roman" w:eastAsia="Times New Roman" w:hAnsi="Times New Roman"/>
+          <w:color w:val="000000"/>
+          <w:sz w:val="25"/>
+          <w:szCs w:val="25"/>
+          <w:rtl w:val="0"/>
+        </w:rPr>
+        <w:t xml:space="preserve">Ngay khi nhận nhà, Bên B sẽ thanh toán cho Bên A số tiền thuê nhà: </w:t>
+      </w:r>
+      <w:r>
+        <w:rPr>
+          <w:rtl w:val="0"/>
+        </w:rPr>
+      </w:r>
+    </w:p>
+    <w:p>
+      <w:pPr>
+        <w:shd w:fill="ffffff" w:val="clear"/>
+        <w:spacing w:after="0" w:line="240" w:lineRule="auto"/>
+        <w:jc w:val="both"/>
+        <w:rPr>
+          <w:rFonts w:ascii="Times New Roman" w:cs="Times New Roman" w:eastAsia="Times New Roman" w:hAnsi="Times New Roman"/>
+          <w:b w:val="1"/>
+          <w:bCs w:val="1"/>
+          <w:color w:val="000000"/>
+          <w:sz w:val="25"/>
+          <w:szCs w:val="25"/>
+        </w:rPr>
+      </w:pPr>
+      <w:r>
+        <w:rPr>
+          <w:rtl w:val="0"/>
+        </w:rPr>
+      </w:r>
+    </w:p>
+    <w:p>
+      <w:pPr>
+        <w:shd w:fill="ffffff" w:val="clear"/>
+        <w:spacing w:after="0" w:line="240" w:lineRule="auto"/>
+        <w:rPr>
+          <w:rFonts w:ascii="Times New Roman" w:cs="Times New Roman" w:eastAsia="Times New Roman" w:hAnsi="Times New Roman"/>
+          <w:b w:val="1"/>
+          <w:bCs w:val="1"/>
           <w:i w:val="1"/>
           <w:iCs w:val="1"/>
           <w:color w:val="000000"/>
@@ -1475,82 +1602,8 @@
       </w:pPr>
       <w:r>
         <w:rPr>
-          <w:rFonts w:ascii="Times New Roman" w:cs="Times New Roman" w:eastAsia="Times New Roman" w:hAnsi="Times New Roman"/>
-          <w:color w:val="000000"/>
-          <w:sz w:val="25"/>
-          <w:szCs w:val="25"/>
-          <w:rtl w:val="0"/>
-        </w:rPr>
-        <w:t xml:space="preserve">4.1. Tiền thuê nhà mỗi tháng là: ${rentAmount} VND (Bằng chữ: ${rentAmountInWords})</w:t>
-      </w:r>
-      <w:r>
-        <w:rPr>
-          <w:rFonts w:ascii="Times New Roman" w:cs="Times New Roman" w:eastAsia="Times New Roman" w:hAnsi="Times New Roman"/>
-          <w:b w:val="1"/>
-          <w:bCs w:val="1"/>
-          <w:sz w:val="25"/>
-          <w:szCs w:val="25"/>
-          <w:rtl w:val="0"/>
-        </w:rPr>
-        <w:t xml:space="preserve"/>
-      </w:r>
-      <w:r>
-        <w:rPr>
-          <w:rtl w:val="0"/>
-        </w:rPr>
-      </w:r>
-    </w:p>
-    <w:p>
-      <w:pPr>
-        <w:shd w:fill="ffffff" w:val="clear"/>
-        <w:spacing w:after="0" w:line="240" w:lineRule="auto"/>
-        <w:jc w:val="both"/>
-        <w:rPr>
-          <w:rFonts w:ascii="Times New Roman" w:cs="Times New Roman" w:eastAsia="Times New Roman" w:hAnsi="Times New Roman"/>
-          <w:b w:val="1"/>
-          <w:bCs w:val="1"/>
-          <w:color w:val="000000"/>
-          <w:sz w:val="25"/>
-          <w:szCs w:val="25"/>
-        </w:rPr>
-      </w:pPr>
-      <w:r>
-        <w:rPr>
-          <w:rFonts w:ascii="Times New Roman" w:cs="Times New Roman" w:eastAsia="Times New Roman" w:hAnsi="Times New Roman"/>
-          <w:color w:val="000000"/>
-          <w:sz w:val="25"/>
-          <w:szCs w:val="25"/>
-          <w:rtl w:val="0"/>
-        </w:rPr>
-        <w:t xml:space="preserve">4.2. Tiền thuê nhà nêu trên sẽ cố định trong thời hạn hợp đồng.</w:t>
-      </w:r>
-      <w:r>
-        <w:rPr>
-          <w:rtl w:val="0"/>
-        </w:rPr>
-      </w:r>
-    </w:p>
-    <w:p>
-      <w:pPr>
-        <w:shd w:fill="ffffff" w:val="clear"/>
-        <w:spacing w:after="150" w:line="240" w:lineRule="auto"/>
-        <w:jc w:val="both"/>
-        <w:rPr>
-          <w:rFonts w:ascii="Times New Roman" w:cs="Times New Roman" w:eastAsia="Times New Roman" w:hAnsi="Times New Roman"/>
-          <w:color w:val="000000"/>
-          <w:sz w:val="25"/>
-          <w:szCs w:val="25"/>
-        </w:rPr>
-      </w:pPr>
-      <w:r>
-        <w:rPr>
-          <w:rFonts w:ascii="Times New Roman" w:cs="Times New Roman" w:eastAsia="Times New Roman" w:hAnsi="Times New Roman"/>
-          <w:color w:val="000000"/>
-          <w:sz w:val="25"/>
-          <w:szCs w:val="25"/>
-          <w:rtl w:val="0"/>
-        </w:rPr>
-        <w:t xml:space="preserve">4.3. Tiền thuê nhà hàng tháng nêu trên không bao gồm các chi phí sử dụng cơ sở hạ tầng như: Phí dịch vụ quản lý tòa nhà và các dịch vụ khác: Điện, nước, điện thoại, truyền hình cáp, internet. Những chi phí này do bên B sử dụng sẽ do bên B tự thanh toán trực tiếp với nhà cung cấp dịch vụ theo đúng thời gian quy định dựa trên khối lượng tiêu thụ hàng tháng của bên B.</w:t>
+          <w:rtl w:val="0"/>
+        </w:rPr>
       </w:r>
     </w:p>
     <w:p>
@@ -1576,491 +1629,6 @@
           <w:u w:val="single"/>
           <w:rtl w:val="0"/>
         </w:rPr>
-        <w:t xml:space="preserve">Điều 5</w:t>
-      </w:r>
-      <w:r>
-        <w:rPr>
-          <w:rFonts w:ascii="Times New Roman" w:cs="Times New Roman" w:eastAsia="Times New Roman" w:hAnsi="Times New Roman"/>
-          <w:b w:val="1"/>
-          <w:bCs w:val="1"/>
-          <w:color w:val="000000"/>
-          <w:sz w:val="25"/>
-          <w:szCs w:val="25"/>
-          <w:rtl w:val="0"/>
-        </w:rPr>
-        <w:t xml:space="preserve">: Đặt cọc và phương thức thanh toán</w:t>
-      </w:r>
-      <w:r>
-        <w:rPr>
-          <w:rtl w:val="0"/>
-        </w:rPr>
-      </w:r>
-    </w:p>
-    <w:p>
-      <w:pPr>
-        <w:shd w:fill="ffffff" w:val="clear"/>
-        <w:spacing w:after="0" w:line="240" w:lineRule="auto"/>
-        <w:jc w:val="both"/>
-        <w:rPr>
-          <w:rFonts w:ascii="Times New Roman" w:cs="Times New Roman" w:eastAsia="Times New Roman" w:hAnsi="Times New Roman"/>
-          <w:b w:val="1"/>
-          <w:bCs w:val="1"/>
-          <w:sz w:val="25"/>
-          <w:szCs w:val="25"/>
-        </w:rPr>
-      </w:pPr>
-      <w:r>
-        <w:rPr>
-          <w:rFonts w:ascii="Times New Roman" w:cs="Times New Roman" w:eastAsia="Times New Roman" w:hAnsi="Times New Roman"/>
-          <w:color w:val="000000"/>
-          <w:sz w:val="25"/>
-          <w:szCs w:val="25"/>
-          <w:rtl w:val="0"/>
-        </w:rPr>
-        <w:t xml:space="preserve">5.1 Đặt cọc: Bên B đặt cọc cho bên A một khoản tiền là: ${deposit} VND (Bằng chữ: ${depositInWords})</w:t>
-      </w:r>
-      <w:r>
-        <w:rPr>
-          <w:rFonts w:ascii="Times New Roman" w:cs="Times New Roman" w:eastAsia="Times New Roman" w:hAnsi="Times New Roman"/>
-          <w:b w:val="1"/>
-          <w:bCs w:val="1"/>
-          <w:sz w:val="25"/>
-          <w:szCs w:val="25"/>
-          <w:rtl w:val="0"/>
-        </w:rPr>
-        <w:t xml:space="preserve"/>
-      </w:r>
-    </w:p>
-    <w:p>
-      <w:pPr>
-        <w:shd w:fill="ffffff" w:val="clear"/>
-        <w:spacing w:after="0" w:line="240" w:lineRule="auto"/>
-        <w:jc w:val="both"/>
-        <w:rPr>
-          <w:rFonts w:ascii="Times New Roman" w:cs="Times New Roman" w:eastAsia="Times New Roman" w:hAnsi="Times New Roman"/>
-          <w:b w:val="1"/>
-          <w:bCs w:val="1"/>
-          <w:color w:val="000000"/>
-          <w:sz w:val="25"/>
-          <w:szCs w:val="25"/>
-        </w:rPr>
-      </w:pPr>
-      <w:r>
-        <w:rPr>
-          <w:rFonts w:ascii="Times New Roman" w:cs="Times New Roman" w:eastAsia="Times New Roman" w:hAnsi="Times New Roman"/>
-          <w:b w:val="1"/>
-          <w:bCs w:val="1"/>
-          <w:sz w:val="25"/>
-          <w:szCs w:val="25"/>
-          <w:rtl w:val="0"/>
-        </w:rPr>
-        <w:t xml:space="preserve"/>
-      </w:r>
-      <w:r>
-        <w:rPr>
-          <w:rFonts w:ascii="Times New Roman" w:cs="Times New Roman" w:eastAsia="Times New Roman" w:hAnsi="Times New Roman"/>
-          <w:b w:val="1"/>
-          <w:bCs w:val="1"/>
-          <w:color w:val="000000"/>
-          <w:sz w:val="25"/>
-          <w:szCs w:val="25"/>
-          <w:rtl w:val="0"/>
-        </w:rPr>
-        <w:t xml:space="preserve"/>
-      </w:r>
-    </w:p>
-    <w:p>
-      <w:pPr>
-        <w:shd w:fill="ffffff" w:val="clear"/>
-        <w:spacing w:after="150" w:line="240" w:lineRule="auto"/>
-        <w:jc w:val="both"/>
-        <w:rPr>
-          <w:rFonts w:ascii="Times New Roman" w:cs="Times New Roman" w:eastAsia="Times New Roman" w:hAnsi="Times New Roman"/>
-          <w:color w:val="000000"/>
-          <w:sz w:val="25"/>
-          <w:szCs w:val="25"/>
-        </w:rPr>
-      </w:pPr>
-      <w:r>
-        <w:rPr>
-          <w:rFonts w:ascii="Times New Roman" w:cs="Times New Roman" w:eastAsia="Times New Roman" w:hAnsi="Times New Roman"/>
-          <w:color w:val="000000"/>
-          <w:sz w:val="25"/>
-          <w:szCs w:val="25"/>
-          <w:rtl w:val="0"/>
-        </w:rPr>
-        <w:t xml:space="preserve">Số tiền đặt cọc này sẽ được trả lại cho Bên B sau khi hợp đồng kết thúc và khi bên B đã thanh toán hết các chi phí sử dụng dịch vụ (được nêu trong khoản 4.3 điều 4) cũng như chi phí bồi thường các hư hỏng, mất mát đối với căn hộ và thiết bị do mình gây ra nếu có.</w:t>
-      </w:r>
-    </w:p>
-    <w:p>
-      <w:pPr>
-        <w:shd w:fill="ffffff" w:val="clear"/>
-        <w:spacing w:after="150" w:line="240" w:lineRule="auto"/>
-        <w:jc w:val="both"/>
-        <w:rPr>
-          <w:rFonts w:ascii="Times New Roman" w:cs="Times New Roman" w:eastAsia="Times New Roman" w:hAnsi="Times New Roman"/>
-          <w:color w:val="000000"/>
-          <w:sz w:val="25"/>
-          <w:szCs w:val="25"/>
-        </w:rPr>
-      </w:pPr>
-      <w:r>
-        <w:rPr>
-          <w:rFonts w:ascii="Times New Roman" w:cs="Times New Roman" w:eastAsia="Times New Roman" w:hAnsi="Times New Roman"/>
-          <w:color w:val="000000"/>
-          <w:sz w:val="25"/>
-          <w:szCs w:val="25"/>
-          <w:rtl w:val="0"/>
-        </w:rPr>
-        <w:t xml:space="preserve">5.2 Hình thức thanh toán: Bằng tiền mặt hoặc bằng chuyển khoản theo số tài khoản:</w:t>
-      </w:r>
-    </w:p>
-    <w:p>
-      <w:pPr>
-        <w:shd w:fill="ffffff" w:val="clear"/>
-        <w:spacing w:after="0" w:line="240" w:lineRule="auto"/>
-        <w:rPr>
-          <w:rFonts w:ascii="Times New Roman" w:cs="Times New Roman" w:eastAsia="Times New Roman" w:hAnsi="Times New Roman"/>
-          <w:b w:val="0"/>
-          <w:bCs w:val="0"/>
-          <w:color w:val="000000"/>
-          <w:sz w:val="25"/>
-          <w:szCs w:val="25"/>
-        </w:rPr>
-      </w:pPr>
-      <w:r>
-        <w:rPr>
-          <w:rFonts w:ascii="Times New Roman" w:cs="Times New Roman" w:eastAsia="Times New Roman" w:hAnsi="Times New Roman"/>
-          <w:b w:val="0"/>
-          <w:bCs w:val="0"/>
-          <w:color w:val="000000"/>
-          <w:sz w:val="25"/>
-          <w:szCs w:val="25"/>
-          <w:rtl w:val="0"/>
-        </w:rPr>
-        <w:t xml:space="preserve">Số tài khoản: </w:t>
-      </w:r>
-      <w:r>
-        <w:rPr>
-          <w:rFonts w:ascii="Times New Roman" w:cs="Times New Roman" w:eastAsia="Times New Roman" w:hAnsi="Times New Roman"/>
-          <w:sz w:val="25"/>
-          <w:szCs w:val="25"/>
-          <w:rtl w:val="0"/>
-        </w:rPr>
-        <w:t xml:space="preserve"/>
-      </w:r>
-      <w:r>
-        <w:rPr>
-          <w:rtl w:val="0"/>
-        </w:rPr>
-      </w:r>
-    </w:p>
-    <w:p>
-      <w:pPr>
-        <w:shd w:fill="ffffff" w:val="clear"/>
-        <w:spacing w:after="0" w:line="240" w:lineRule="auto"/>
-        <w:rPr>
-          <w:rFonts w:ascii="Times New Roman" w:cs="Times New Roman" w:eastAsia="Times New Roman" w:hAnsi="Times New Roman"/>
-          <w:b w:val="0"/>
-          <w:bCs w:val="0"/>
-          <w:color w:val="000000"/>
-          <w:sz w:val="25"/>
-          <w:szCs w:val="25"/>
-        </w:rPr>
-      </w:pPr>
-      <w:r>
-        <w:rPr>
-          <w:rFonts w:ascii="Times New Roman" w:cs="Times New Roman" w:eastAsia="Times New Roman" w:hAnsi="Times New Roman"/>
-          <w:b w:val="0"/>
-          <w:bCs w:val="0"/>
-          <w:color w:val="000000"/>
-          <w:sz w:val="25"/>
-          <w:szCs w:val="25"/>
-          <w:rtl w:val="0"/>
-        </w:rPr>
-        <w:t xml:space="preserve">Chủ tài khoản: </w:t>
-      </w:r>
-      <w:r>
-        <w:rPr>
-          <w:rFonts w:ascii="Times New Roman" w:cs="Times New Roman" w:eastAsia="Times New Roman" w:hAnsi="Times New Roman"/>
-          <w:b w:val="1"/>
-          <w:bCs w:val="1"/>
-          <w:sz w:val="25"/>
-          <w:szCs w:val="25"/>
-          <w:rtl w:val="0"/>
-        </w:rPr>
-        <w:t xml:space="preserve"/>
-      </w:r>
-      <w:r>
-        <w:rPr>
-          <w:rtl w:val="0"/>
-        </w:rPr>
-      </w:r>
-    </w:p>
-    <w:p>
-      <w:pPr>
-        <w:shd w:fill="ffffff" w:val="clear"/>
-        <w:spacing w:after="150" w:line="240" w:lineRule="auto"/>
-        <w:jc w:val="both"/>
-        <w:rPr>
-          <w:rFonts w:ascii="Times New Roman" w:cs="Times New Roman" w:eastAsia="Times New Roman" w:hAnsi="Times New Roman"/>
-          <w:b w:val="0"/>
-          <w:bCs w:val="0"/>
-          <w:color w:val="000000"/>
-          <w:sz w:val="25"/>
-          <w:szCs w:val="25"/>
-        </w:rPr>
-      </w:pPr>
-      <w:r>
-        <w:rPr>
-          <w:rFonts w:ascii="Times New Roman" w:cs="Times New Roman" w:eastAsia="Times New Roman" w:hAnsi="Times New Roman"/>
-          <w:b w:val="0"/>
-          <w:bCs w:val="0"/>
-          <w:color w:val="000000"/>
-          <w:sz w:val="25"/>
-          <w:szCs w:val="25"/>
-          <w:rtl w:val="0"/>
-        </w:rPr>
-        <w:t xml:space="preserve">Ngân hàng: </w:t>
-      </w:r>
-      <w:r>
-        <w:rPr>
-          <w:rFonts w:ascii="Times New Roman" w:cs="Times New Roman" w:eastAsia="Times New Roman" w:hAnsi="Times New Roman"/>
-          <w:sz w:val="25"/>
-          <w:szCs w:val="25"/>
-          <w:rtl w:val="0"/>
-        </w:rPr>
-        <w:t xml:space="preserve"/>
-      </w:r>
-      <w:r>
-        <w:rPr>
-          <w:rtl w:val="0"/>
-        </w:rPr>
-      </w:r>
-    </w:p>
-    <w:p>
-      <w:pPr>
-        <w:shd w:fill="ffffff" w:val="clear"/>
-        <w:spacing w:after="150" w:line="240" w:lineRule="auto"/>
-        <w:jc w:val="both"/>
-        <w:rPr>
-          <w:rFonts w:ascii="Times New Roman" w:cs="Times New Roman" w:eastAsia="Times New Roman" w:hAnsi="Times New Roman"/>
-          <w:b w:val="1"/>
-          <w:bCs w:val="1"/>
-          <w:color w:val="000000"/>
-          <w:sz w:val="25"/>
-          <w:szCs w:val="25"/>
-        </w:rPr>
-      </w:pPr>
-      <w:r>
-        <w:rPr>
-          <w:rtl w:val="0"/>
-        </w:rPr>
-      </w:r>
-    </w:p>
-    <w:p>
-      <w:pPr>
-        <w:shd w:fill="ffffff" w:val="clear"/>
-        <w:spacing w:after="150" w:line="240" w:lineRule="auto"/>
-        <w:jc w:val="both"/>
-        <w:rPr>
-          <w:rFonts w:ascii="Times New Roman" w:cs="Times New Roman" w:eastAsia="Times New Roman" w:hAnsi="Times New Roman"/>
-          <w:color w:val="000000"/>
-          <w:sz w:val="25"/>
-          <w:szCs w:val="25"/>
-        </w:rPr>
-      </w:pPr>
-      <w:r>
-        <w:rPr>
-          <w:rFonts w:ascii="Times New Roman" w:cs="Times New Roman" w:eastAsia="Times New Roman" w:hAnsi="Times New Roman"/>
-          <w:color w:val="000000"/>
-          <w:sz w:val="25"/>
-          <w:szCs w:val="25"/>
-          <w:rtl w:val="0"/>
-        </w:rPr>
-        <w:t xml:space="preserve">5.3. Đồng tiền thanh toán: Thanh toán bằng đồng tiền Việt Nam Đồng (VND).</w:t>
-      </w:r>
-    </w:p>
-    <w:p>
-      <w:pPr>
-        <w:shd w:fill="ffffff" w:val="clear"/>
-        <w:spacing w:after="150" w:line="240" w:lineRule="auto"/>
-        <w:jc w:val="both"/>
-        <w:rPr>
-          <w:rFonts w:ascii="Times New Roman" w:cs="Times New Roman" w:eastAsia="Times New Roman" w:hAnsi="Times New Roman"/>
-          <w:color w:val="000000"/>
-          <w:sz w:val="25"/>
-          <w:szCs w:val="25"/>
-        </w:rPr>
-      </w:pPr>
-      <w:r>
-        <w:rPr>
-          <w:rFonts w:ascii="Times New Roman" w:cs="Times New Roman" w:eastAsia="Times New Roman" w:hAnsi="Times New Roman"/>
-          <w:color w:val="000000"/>
-          <w:sz w:val="25"/>
-          <w:szCs w:val="25"/>
-          <w:rtl w:val="0"/>
-        </w:rPr>
-        <w:t xml:space="preserve">5.4 Thời gian thanh toán: Ngày 01-05 hàng tháng.</w:t>
-      </w:r>
-    </w:p>
-    <w:p>
-      <w:pPr>
-        <w:shd w:fill="ffffff" w:val="clear"/>
-        <w:spacing w:after="0" w:line="240" w:lineRule="auto"/>
-        <w:rPr>
-          <w:rFonts w:ascii="Times New Roman" w:cs="Times New Roman" w:eastAsia="Times New Roman" w:hAnsi="Times New Roman"/>
-          <w:b w:val="0"/>
-          <w:bCs w:val="0"/>
-          <w:color w:val="000000"/>
-          <w:sz w:val="25"/>
-          <w:szCs w:val="25"/>
-        </w:rPr>
-      </w:pPr>
-      <w:r>
-        <w:rPr>
-          <w:rFonts w:ascii="Times New Roman" w:cs="Times New Roman" w:eastAsia="Times New Roman" w:hAnsi="Times New Roman"/>
-          <w:color w:val="000000"/>
-          <w:sz w:val="25"/>
-          <w:szCs w:val="25"/>
-          <w:rtl w:val="0"/>
-        </w:rPr>
-        <w:t xml:space="preserve">Ngay khi ký kết hợp đồng, Bên B sẽ thanh toán thêm cho Bên A số tiền đặt cọc: ${deposit} VND</w:t>
-      </w:r>
-      <w:r>
-        <w:rPr>
-          <w:rFonts w:ascii="Times New Roman" w:cs="Times New Roman" w:eastAsia="Times New Roman" w:hAnsi="Times New Roman"/>
-          <w:b w:val="1"/>
-          <w:bCs w:val="1"/>
-          <w:sz w:val="25"/>
-          <w:szCs w:val="25"/>
-          <w:rtl w:val="0"/>
-        </w:rPr>
-        <w:t xml:space="preserve"/>
-      </w:r>
-      <w:r>
-        <w:rPr>
-          <w:rtl w:val="0"/>
-        </w:rPr>
-      </w:r>
-    </w:p>
-    <w:p>
-      <w:pPr>
-        <w:shd w:fill="ffffff" w:val="clear"/>
-        <w:spacing w:after="0" w:line="240" w:lineRule="auto"/>
-        <w:jc w:val="both"/>
-        <w:rPr>
-          <w:rFonts w:ascii="Times New Roman" w:cs="Times New Roman" w:eastAsia="Times New Roman" w:hAnsi="Times New Roman"/>
-          <w:b w:val="1"/>
-          <w:bCs w:val="1"/>
-          <w:sz w:val="25"/>
-          <w:szCs w:val="25"/>
-        </w:rPr>
-      </w:pPr>
-      <w:r>
-        <w:rPr>
-          <w:rFonts w:ascii="Times New Roman" w:cs="Times New Roman" w:eastAsia="Times New Roman" w:hAnsi="Times New Roman"/>
-          <w:color w:val="000000"/>
-          <w:sz w:val="25"/>
-          <w:szCs w:val="25"/>
-          <w:rtl w:val="0"/>
-        </w:rPr>
-        <w:t xml:space="preserve">Ngay khi nhận nhà, Bên B sẽ thanh toán cho Bên A số tiền thuê nhà: </w:t>
-      </w:r>
-      <w:r>
-        <w:rPr>
-          <w:rFonts w:ascii="Times New Roman" w:cs="Times New Roman" w:eastAsia="Times New Roman" w:hAnsi="Times New Roman"/>
-          <w:b w:val="1"/>
-          <w:bCs w:val="1"/>
-          <w:sz w:val="25"/>
-          <w:szCs w:val="25"/>
-          <w:rtl w:val="0"/>
-        </w:rPr>
-        <w:t xml:space="preserve"/>
-      </w:r>
-    </w:p>
-    <w:p>
-      <w:pPr>
-        <w:shd w:fill="ffffff" w:val="clear"/>
-        <w:spacing w:after="0" w:line="240" w:lineRule="auto"/>
-        <w:jc w:val="both"/>
-        <w:rPr>
-          <w:rFonts w:ascii="Times New Roman" w:cs="Times New Roman" w:eastAsia="Times New Roman" w:hAnsi="Times New Roman"/>
-          <w:b w:val="1"/>
-          <w:bCs w:val="1"/>
-          <w:color w:val="000000"/>
-          <w:sz w:val="25"/>
-          <w:szCs w:val="25"/>
-        </w:rPr>
-      </w:pPr>
-      <w:r>
-        <w:rPr>
-          <w:rFonts w:ascii="Times New Roman" w:cs="Times New Roman" w:eastAsia="Times New Roman" w:hAnsi="Times New Roman"/>
-          <w:b w:val="1"/>
-          <w:bCs w:val="1"/>
-          <w:sz w:val="25"/>
-          <w:szCs w:val="25"/>
-          <w:rtl w:val="0"/>
-        </w:rPr>
-        <w:t xml:space="preserve"/>
-      </w:r>
-      <w:r>
-        <w:rPr>
-          <w:rFonts w:ascii="Times New Roman" w:cs="Times New Roman" w:eastAsia="Times New Roman" w:hAnsi="Times New Roman"/>
-          <w:b w:val="1"/>
-          <w:bCs w:val="1"/>
-          <w:color w:val="000000"/>
-          <w:sz w:val="25"/>
-          <w:szCs w:val="25"/>
-          <w:rtl w:val="0"/>
-        </w:rPr>
-        <w:t xml:space="preserve"/>
-      </w:r>
-    </w:p>
-    <w:p>
-      <w:pPr>
-        <w:shd w:fill="ffffff" w:val="clear"/>
-        <w:spacing w:after="0" w:line="240" w:lineRule="auto"/>
-        <w:rPr>
-          <w:rFonts w:ascii="Times New Roman" w:cs="Times New Roman" w:eastAsia="Times New Roman" w:hAnsi="Times New Roman"/>
-          <w:b w:val="1"/>
-          <w:bCs w:val="1"/>
-          <w:i w:val="1"/>
-          <w:iCs w:val="1"/>
-          <w:color w:val="000000"/>
-          <w:sz w:val="25"/>
-          <w:szCs w:val="25"/>
-        </w:rPr>
-      </w:pPr>
-      <w:r>
-        <w:rPr>
-          <w:rtl w:val="0"/>
-        </w:rPr>
-      </w:r>
-    </w:p>
-    <w:p>
-      <w:pPr>
-        <w:shd w:fill="ffffff" w:val="clear"/>
-        <w:spacing w:after="0" w:line="240" w:lineRule="auto"/>
-        <w:jc w:val="both"/>
-        <w:rPr>
-          <w:rFonts w:ascii="Times New Roman" w:cs="Times New Roman" w:eastAsia="Times New Roman" w:hAnsi="Times New Roman"/>
-          <w:color w:val="000000"/>
-          <w:sz w:val="25"/>
-          <w:szCs w:val="25"/>
-        </w:rPr>
-      </w:pPr>
-      <w:r>
-        <w:rPr>
-          <w:rFonts w:ascii="Times New Roman" w:cs="Times New Roman" w:eastAsia="Times New Roman" w:hAnsi="Times New Roman"/>
-          <w:b w:val="1"/>
-          <w:bCs w:val="1"/>
-          <w:color w:val="000000"/>
-          <w:sz w:val="25"/>
-          <w:szCs w:val="25"/>
-          <w:u w:val="single"/>
-          <w:rtl w:val="0"/>
-        </w:rPr>
         <w:t xml:space="preserve">Điều 6</w:t>
       </w:r>
       <w:r>
@@ -2222,7 +1790,7 @@
           <w:szCs w:val="25"/>
         </w:rPr>
       </w:pPr>
-      <w:bookmarkStart w:colFirst="0" w:colLast="0" w:name="_d44hj62sqxud" w:id="0"/>
+      <w:bookmarkStart w:colFirst="0" w:colLast="0" w:name="_ayqohw9mimd" w:id="0"/>
       <w:bookmarkEnd w:id="0"/>
       <w:r>
         <w:rPr>
@@ -2236,66 +1804,43 @@
       </w:r>
       <w:r>
         <w:rPr>
-          <w:rFonts w:ascii="Times New Roman" w:cs="Times New Roman" w:eastAsia="Times New Roman" w:hAnsi="Times New Roman"/>
-          <w:b w:val="1"/>
-          <w:bCs w:val="1"/>
-          <w:sz w:val="25"/>
-          <w:szCs w:val="25"/>
-          <w:rtl w:val="0"/>
-        </w:rPr>
-        <w:t xml:space="preserve"/>
-      </w:r>
-    </w:p>
-    <w:p>
-      <w:pPr>
-        <w:shd w:fill="ffffff" w:val="clear"/>
-        <w:spacing w:after="150" w:line="240" w:lineRule="auto"/>
-        <w:rPr>
-          <w:rFonts w:ascii="Times New Roman" w:cs="Times New Roman" w:eastAsia="Times New Roman" w:hAnsi="Times New Roman"/>
-          <w:b w:val="1"/>
-          <w:bCs w:val="1"/>
-          <w:sz w:val="25"/>
-          <w:szCs w:val="25"/>
-        </w:rPr>
-      </w:pPr>
-      <w:bookmarkStart w:colFirst="0" w:colLast="0" w:name="_vasj75bb9sxk" w:id="1"/>
+          <w:rtl w:val="0"/>
+        </w:rPr>
+      </w:r>
+    </w:p>
+    <w:p>
+      <w:pPr>
+        <w:shd w:fill="ffffff" w:val="clear"/>
+        <w:spacing w:after="150" w:line="240" w:lineRule="auto"/>
+        <w:rPr>
+          <w:rFonts w:ascii="Times New Roman" w:cs="Times New Roman" w:eastAsia="Times New Roman" w:hAnsi="Times New Roman"/>
+          <w:b w:val="1"/>
+          <w:bCs w:val="1"/>
+          <w:sz w:val="25"/>
+          <w:szCs w:val="25"/>
+        </w:rPr>
+      </w:pPr>
+      <w:bookmarkStart w:colFirst="0" w:colLast="0" w:name="_ksk3rfo41r40" w:id="1"/>
       <w:bookmarkEnd w:id="1"/>
       <w:r>
         <w:rPr>
-          <w:rFonts w:ascii="Times New Roman" w:cs="Times New Roman" w:eastAsia="Times New Roman" w:hAnsi="Times New Roman"/>
-          <w:b w:val="1"/>
-          <w:bCs w:val="1"/>
-          <w:sz w:val="25"/>
-          <w:szCs w:val="25"/>
-          <w:rtl w:val="0"/>
-        </w:rPr>
-        <w:t xml:space="preserve"/>
-      </w:r>
-    </w:p>
-    <w:p>
-      <w:pPr>
-        <w:shd w:fill="ffffff" w:val="clear"/>
-        <w:spacing w:after="150" w:line="240" w:lineRule="auto"/>
-        <w:rPr>
-          <w:rFonts w:ascii="Times New Roman" w:cs="Times New Roman" w:eastAsia="Times New Roman" w:hAnsi="Times New Roman"/>
-          <w:color w:val="000000"/>
-          <w:sz w:val="25"/>
-          <w:szCs w:val="25"/>
-        </w:rPr>
-      </w:pPr>
-      <w:bookmarkStart w:colFirst="0" w:colLast="0" w:name="_xcwqusnyahi" w:id="2"/>
+          <w:rtl w:val="0"/>
+        </w:rPr>
+      </w:r>
+    </w:p>
+    <w:p>
+      <w:pPr>
+        <w:shd w:fill="ffffff" w:val="clear"/>
+        <w:spacing w:after="150" w:line="240" w:lineRule="auto"/>
+        <w:rPr>
+          <w:rFonts w:ascii="Times New Roman" w:cs="Times New Roman" w:eastAsia="Times New Roman" w:hAnsi="Times New Roman"/>
+          <w:color w:val="000000"/>
+          <w:sz w:val="25"/>
+          <w:szCs w:val="25"/>
+        </w:rPr>
+      </w:pPr>
+      <w:bookmarkStart w:colFirst="0" w:colLast="0" w:name="_eahk9xdiq8wz" w:id="2"/>
       <w:bookmarkEnd w:id="2"/>
-      <w:r>
-        <w:rPr>
-          <w:rFonts w:ascii="Times New Roman" w:cs="Times New Roman" w:eastAsia="Times New Roman" w:hAnsi="Times New Roman"/>
-          <w:b w:val="1"/>
-          <w:bCs w:val="1"/>
-          <w:sz w:val="25"/>
-          <w:szCs w:val="25"/>
-          <w:rtl w:val="0"/>
-        </w:rPr>
-        <w:t xml:space="preserve"/>
-      </w:r>
       <w:r>
         <w:rPr>
           <w:rFonts w:ascii="Times New Roman" w:cs="Times New Roman" w:eastAsia="Times New Roman" w:hAnsi="Times New Roman"/>
@@ -3212,13 +2757,8 @@
             </w:pPr>
             <w:r>
               <w:rPr>
-                <w:rFonts w:ascii="Times New Roman" w:cs="Times New Roman" w:eastAsia="Times New Roman" w:hAnsi="Times New Roman"/>
-                <w:color w:val="000000"/>
-                <w:sz w:val="25"/>
-                <w:szCs w:val="25"/>
                 <w:rtl w:val="0"/>
               </w:rPr>
-              <w:t xml:space="preserve"/>
             </w:r>
           </w:p>
         </w:tc>

</xml_diff>

<commit_message>
remove payment method (only banking no cash)
</commit_message>
<xml_diff>
--- a/src/main/resources/templates/contract/tenant-apartment-draft-template.docx
+++ b/src/main/resources/templates/contract/tenant-apartment-draft-template.docx
@@ -250,6 +250,44 @@
         </w:rPr>
         <w:t xml:space="preserve">Hôm nay, ngày ${signDay} tháng ${signMonth} năm ${signYear}, tại ${signPlace}, chúng tôi gồm:</w:t>
       </w:r>
+      <w:r>
+        <w:rPr>
+          <w:rFonts w:ascii="Times New Roman" w:cs="Times New Roman" w:eastAsia="Times New Roman" w:hAnsi="Times New Roman"/>
+          <w:sz w:val="25"/>
+          <w:szCs w:val="25"/>
+          <w:rtl w:val="0"/>
+        </w:rPr>
+        <w:t xml:space="preserve"/>
+      </w:r>
+      <w:r>
+        <w:rPr>
+          <w:rFonts w:ascii="Times New Roman" w:cs="Times New Roman" w:eastAsia="Times New Roman" w:hAnsi="Times New Roman"/>
+          <w:color w:val="000000"/>
+          <w:sz w:val="25"/>
+          <w:szCs w:val="25"/>
+          <w:rtl w:val="0"/>
+        </w:rPr>
+        <w:t xml:space="preserve"/>
+      </w:r>
+      <w:r>
+        <w:rPr>
+          <w:rFonts w:ascii="Times New Roman" w:cs="Times New Roman" w:eastAsia="Times New Roman" w:hAnsi="Times New Roman"/>
+          <w:sz w:val="25"/>
+          <w:szCs w:val="25"/>
+          <w:rtl w:val="0"/>
+        </w:rPr>
+        <w:t xml:space="preserve"/>
+      </w:r>
+      <w:r>
+        <w:rPr>
+          <w:rFonts w:ascii="Times New Roman" w:cs="Times New Roman" w:eastAsia="Times New Roman" w:hAnsi="Times New Roman"/>
+          <w:color w:val="000000"/>
+          <w:sz w:val="25"/>
+          <w:szCs w:val="25"/>
+          <w:rtl w:val="0"/>
+        </w:rPr>
+        <w:t xml:space="preserve"/>
+      </w:r>
     </w:p>
     <w:p>
       <w:pPr>
@@ -397,6 +435,26 @@
           <w:rtl w:val="0"/>
         </w:rPr>
         <w:t xml:space="preserve">HKTT</w:t>
+      </w:r>
+      <w:r>
+        <w:rPr>
+          <w:rFonts w:ascii="Times New Roman" w:cs="Times New Roman" w:eastAsia="Times New Roman" w:hAnsi="Times New Roman"/>
+          <w:sz w:val="25"/>
+          <w:szCs w:val="25"/>
+          <w:rtl w:val="0"/>
+        </w:rPr>
+        <w:t xml:space="preserve"/>
+      </w:r>
+      <w:r>
+        <w:rPr>
+          <w:rFonts w:ascii="Times New Roman" w:cs="Times New Roman" w:eastAsia="Times New Roman" w:hAnsi="Times New Roman"/>
+          <w:b w:val="0"/>
+          <w:bCs w:val="0"/>
+          <w:color w:val="000000"/>
+          <w:sz w:val="25"/>
+          <w:szCs w:val="25"/>
+          <w:rtl w:val="0"/>
+        </w:rPr>
         <w:br w:type="textWrapping"/>
         <w:t xml:space="preserve">Điện thoại: ……………..……………</w:t>
       </w:r>
@@ -513,7 +571,30 @@
           <w:szCs w:val="25"/>
           <w:rtl w:val="0"/>
         </w:rPr>
-        <w:t xml:space="preserve">Ông/bà: ${tenantFullName}  </w:t>
+        <w:t xml:space="preserve">Ông/bà: ${tenantFullName}</w:t>
+      </w:r>
+      <w:r>
+        <w:rPr>
+          <w:rFonts w:ascii="Times New Roman" w:cs="Times New Roman" w:eastAsia="Times New Roman" w:hAnsi="Times New Roman"/>
+          <w:b w:val="1"/>
+          <w:bCs w:val="1"/>
+          <w:sz w:val="25"/>
+          <w:szCs w:val="25"/>
+          <w:rtl w:val="0"/>
+        </w:rPr>
+        <w:t xml:space="preserve"/>
+      </w:r>
+      <w:r>
+        <w:rPr>
+          <w:rFonts w:ascii="Times New Roman" w:cs="Times New Roman" w:eastAsia="Times New Roman" w:hAnsi="Times New Roman"/>
+          <w:b w:val="1"/>
+          <w:bCs w:val="1"/>
+          <w:color w:val="000000"/>
+          <w:sz w:val="25"/>
+          <w:szCs w:val="25"/>
+          <w:rtl w:val="0"/>
+        </w:rPr>
+        <w:t xml:space="preserve">  </w:t>
       </w:r>
     </w:p>
     <w:p>
@@ -532,6 +613,16 @@
       <w:r>
         <w:rPr>
           <w:rFonts w:ascii="Times New Roman" w:cs="Times New Roman" w:eastAsia="Times New Roman" w:hAnsi="Times New Roman"/>
+          <w:color w:val="000000"/>
+          <w:sz w:val="25"/>
+          <w:szCs w:val="25"/>
+          <w:rtl w:val="0"/>
+        </w:rPr>
+        <w:t xml:space="preserve"/>
+      </w:r>
+      <w:r>
+        <w:rPr>
+          <w:rFonts w:ascii="Times New Roman" w:cs="Times New Roman" w:eastAsia="Times New Roman" w:hAnsi="Times New Roman"/>
           <w:b w:val="0"/>
           <w:bCs w:val="0"/>
           <w:color w:val="000000"/>
@@ -539,53 +630,18 @@
           <w:szCs w:val="25"/>
           <w:rtl w:val="0"/>
         </w:rPr>
-        <w:t xml:space="preserve">Số CCCD: ${tenantCccd} </w:t>
-      </w:r>
-    </w:p>
-    <w:p>
-      <w:pPr>
-        <w:shd w:fill="ffffff" w:val="clear"/>
-        <w:spacing w:after="0" w:line="240" w:lineRule="auto"/>
-        <w:rPr>
-          <w:rFonts w:ascii="Times New Roman" w:cs="Times New Roman" w:eastAsia="Times New Roman" w:hAnsi="Times New Roman"/>
-          <w:sz w:val="25"/>
-          <w:szCs w:val="25"/>
-        </w:rPr>
-      </w:pPr>
-      <w:r>
-        <w:rPr>
-          <w:rFonts w:ascii="Times New Roman" w:cs="Times New Roman" w:eastAsia="Times New Roman" w:hAnsi="Times New Roman"/>
-          <w:sz w:val="25"/>
-          <w:szCs w:val="25"/>
-          <w:rtl w:val="0"/>
-        </w:rPr>
-        <w:t xml:space="preserve">Nơi cấp: </w:t>
-      </w:r>
-    </w:p>
-    <w:p>
-      <w:pPr>
-        <w:shd w:fill="ffffff" w:val="clear"/>
-        <w:spacing w:after="0" w:line="240" w:lineRule="auto"/>
-        <w:rPr>
-          <w:rFonts w:ascii="Times New Roman" w:cs="Times New Roman" w:eastAsia="Times New Roman" w:hAnsi="Times New Roman"/>
-          <w:sz w:val="25"/>
-          <w:szCs w:val="25"/>
-        </w:rPr>
-      </w:pPr>
-      <w:r>
-        <w:rPr>
-          <w:rFonts w:ascii="Times New Roman" w:cs="Times New Roman" w:eastAsia="Times New Roman" w:hAnsi="Times New Roman"/>
-          <w:sz w:val="25"/>
-          <w:szCs w:val="25"/>
-          <w:rtl w:val="0"/>
-        </w:rPr>
-        <w:t xml:space="preserve">Ngày cấp: </w:t>
-      </w:r>
-    </w:p>
-    <w:p>
-      <w:pPr>
-        <w:shd w:fill="ffffff" w:val="clear"/>
-        <w:spacing w:after="0" w:line="240" w:lineRule="auto"/>
+        <w:t xml:space="preserve">Số CCCD: ${tenantCccd}</w:t>
+      </w:r>
+      <w:r>
+        <w:rPr>
+          <w:rFonts w:ascii="Times New Roman" w:cs="Times New Roman" w:eastAsia="Times New Roman" w:hAnsi="Times New Roman"/>
+          <w:sz w:val="25"/>
+          <w:szCs w:val="25"/>
+          <w:rtl w:val="0"/>
+        </w:rPr>
+        <w:t xml:space="preserve"/>
+      </w:r>
+      <w:r>
         <w:rPr>
           <w:rFonts w:ascii="Times New Roman" w:cs="Times New Roman" w:eastAsia="Times New Roman" w:hAnsi="Times New Roman"/>
           <w:b w:val="0"/>
@@ -593,8 +649,19 @@
           <w:color w:val="000000"/>
           <w:sz w:val="25"/>
           <w:szCs w:val="25"/>
-        </w:rPr>
-      </w:pPr>
+          <w:rtl w:val="0"/>
+        </w:rPr>
+        <w:t xml:space="preserve">Ngày sinh: ${tenantDob}</w:t>
+      </w:r>
+      <w:r>
+        <w:rPr>
+          <w:rFonts w:ascii="Times New Roman" w:cs="Times New Roman" w:eastAsia="Times New Roman" w:hAnsi="Times New Roman"/>
+          <w:sz w:val="25"/>
+          <w:szCs w:val="25"/>
+          <w:rtl w:val="0"/>
+        </w:rPr>
+        <w:t xml:space="preserve"/>
+      </w:r>
       <w:r>
         <w:rPr>
           <w:rFonts w:ascii="Times New Roman" w:cs="Times New Roman" w:eastAsia="Times New Roman" w:hAnsi="Times New Roman"/>
@@ -605,7 +672,21 @@
           <w:szCs w:val="25"/>
           <w:rtl w:val="0"/>
         </w:rPr>
-        <w:t xml:space="preserve">Ngày sinh: ${tenantDob}</w:t>
+        <w:t xml:space="preserve">Cấp ngày: ${tenantCccdIssueDate} — Nơi cấp: ${tenantCccdIssuePlace}</w:t>
+      </w:r>
+      <w:r>
+        <w:rPr>
+          <w:rFonts w:ascii="Times New Roman" w:cs="Times New Roman" w:eastAsia="Times New Roman" w:hAnsi="Times New Roman"/>
+          <w:sz w:val="25"/>
+          <w:szCs w:val="25"/>
+          <w:rtl w:val="0"/>
+        </w:rPr>
+        <w:t xml:space="preserve"/>
+      </w:r>
+      <w:r>
+        <w:rPr>
+          <w:rtl w:val="0"/>
+        </w:rPr>
       </w:r>
     </w:p>
     <w:p>
@@ -633,6 +714,20 @@
         </w:rPr>
         <w:t xml:space="preserve">HKTT: ${tenantAddress}</w:t>
       </w:r>
+      <w:r>
+        <w:rPr>
+          <w:rFonts w:ascii="Times New Roman" w:cs="Times New Roman" w:eastAsia="Times New Roman" w:hAnsi="Times New Roman"/>
+          <w:sz w:val="25"/>
+          <w:szCs w:val="25"/>
+          <w:rtl w:val="0"/>
+        </w:rPr>
+        <w:t xml:space="preserve"/>
+      </w:r>
+      <w:r>
+        <w:rPr>
+          <w:rtl w:val="0"/>
+        </w:rPr>
+      </w:r>
     </w:p>
     <w:p>
       <w:pPr>
@@ -669,6 +764,23 @@
       </w:pPr>
       <w:r>
         <w:rPr>
+          <w:rtl w:val="0"/>
+        </w:rPr>
+      </w:r>
+    </w:p>
+    <w:p>
+      <w:pPr>
+        <w:shd w:fill="ffffff" w:val="clear"/>
+        <w:spacing w:after="0" w:line="240" w:lineRule="auto"/>
+        <w:rPr>
+          <w:rFonts w:ascii="Times New Roman" w:cs="Times New Roman" w:eastAsia="Times New Roman" w:hAnsi="Times New Roman"/>
+          <w:color w:val="000000"/>
+          <w:sz w:val="25"/>
+          <w:szCs w:val="25"/>
+        </w:rPr>
+      </w:pPr>
+      <w:r>
+        <w:rPr>
           <w:rFonts w:ascii="Times New Roman" w:cs="Times New Roman" w:eastAsia="Times New Roman" w:hAnsi="Times New Roman"/>
           <w:color w:val="000000"/>
           <w:sz w:val="25"/>
@@ -691,6 +803,29 @@
           <w:szCs w:val="25"/>
         </w:rPr>
       </w:pPr>
+      <w:r>
+        <w:rPr>
+          <w:rFonts w:ascii="Times New Roman" w:cs="Times New Roman" w:eastAsia="Times New Roman" w:hAnsi="Times New Roman"/>
+          <w:b w:val="1"/>
+          <w:bCs w:val="1"/>
+          <w:color w:val="000000"/>
+          <w:sz w:val="25"/>
+          <w:szCs w:val="25"/>
+          <w:rtl w:val="0"/>
+        </w:rPr>
+        <w:t xml:space="preserve"/>
+      </w:r>
+      <w:r>
+        <w:rPr>
+          <w:rFonts w:ascii="Times New Roman" w:cs="Times New Roman" w:eastAsia="Times New Roman" w:hAnsi="Times New Roman"/>
+          <w:b w:val="1"/>
+          <w:bCs w:val="1"/>
+          <w:sz w:val="25"/>
+          <w:szCs w:val="25"/>
+          <w:rtl w:val="0"/>
+        </w:rPr>
+        <w:t xml:space="preserve"/>
+      </w:r>
       <w:r>
         <w:rPr>
           <w:rtl w:val="0"/>
@@ -712,14 +847,15 @@
       </w:pPr>
       <w:r>
         <w:rPr>
-          <w:rtl w:val="0"/>
-        </w:rPr>
-      </w:r>
-    </w:p>
-    <w:p>
-      <w:pPr>
-        <w:shd w:fill="ffffff" w:val="clear"/>
-        <w:spacing w:after="0" w:line="240" w:lineRule="auto"/>
+          <w:rFonts w:ascii="Times New Roman" w:cs="Times New Roman" w:eastAsia="Times New Roman" w:hAnsi="Times New Roman"/>
+          <w:color w:val="000000"/>
+          <w:sz w:val="25"/>
+          <w:szCs w:val="25"/>
+          <w:rtl w:val="0"/>
+        </w:rPr>
+        <w:t xml:space="preserve"/>
+      </w:r>
+      <w:r>
         <w:rPr>
           <w:rFonts w:ascii="Times New Roman" w:cs="Times New Roman" w:eastAsia="Times New Roman" w:hAnsi="Times New Roman"/>
           <w:b w:val="0"/>
@@ -727,28 +863,104 @@
           <w:color w:val="000000"/>
           <w:sz w:val="25"/>
           <w:szCs w:val="25"/>
-        </w:rPr>
-      </w:pPr>
-      <w:r>
-        <w:rPr>
-          <w:rtl w:val="0"/>
-        </w:rPr>
-      </w:r>
-    </w:p>
-    <w:p>
-      <w:pPr>
-        <w:shd w:fill="ffffff" w:val="clear"/>
-        <w:spacing w:after="0" w:line="240" w:lineRule="auto"/>
-        <w:rPr>
-          <w:rFonts w:ascii="Times New Roman" w:cs="Times New Roman" w:eastAsia="Times New Roman" w:hAnsi="Times New Roman"/>
-          <w:sz w:val="25"/>
-          <w:szCs w:val="25"/>
-        </w:rPr>
-      </w:pPr>
-      <w:r>
-        <w:rPr>
-          <w:rtl w:val="0"/>
-        </w:rPr>
+          <w:rtl w:val="0"/>
+        </w:rPr>
+        <w:t xml:space="preserve"/>
+      </w:r>
+      <w:r>
+        <w:rPr>
+          <w:rFonts w:ascii="Times New Roman" w:cs="Times New Roman" w:eastAsia="Times New Roman" w:hAnsi="Times New Roman"/>
+          <w:sz w:val="25"/>
+          <w:szCs w:val="25"/>
+          <w:rtl w:val="0"/>
+        </w:rPr>
+        <w:t xml:space="preserve"/>
+      </w:r>
+      <w:r>
+        <w:rPr>
+          <w:rFonts w:ascii="Times New Roman" w:cs="Times New Roman" w:eastAsia="Times New Roman" w:hAnsi="Times New Roman"/>
+          <w:b w:val="0"/>
+          <w:bCs w:val="0"/>
+          <w:color w:val="000000"/>
+          <w:sz w:val="25"/>
+          <w:szCs w:val="25"/>
+          <w:rtl w:val="0"/>
+        </w:rPr>
+        <w:t xml:space="preserve"/>
+      </w:r>
+      <w:r>
+        <w:rPr>
+          <w:rFonts w:ascii="Times New Roman" w:cs="Times New Roman" w:eastAsia="Times New Roman" w:hAnsi="Times New Roman"/>
+          <w:sz w:val="25"/>
+          <w:szCs w:val="25"/>
+          <w:rtl w:val="0"/>
+        </w:rPr>
+        <w:t xml:space="preserve"/>
+      </w:r>
+      <w:r>
+        <w:rPr>
+          <w:rtl w:val="0"/>
+        </w:rPr>
+      </w:r>
+    </w:p>
+    <w:p>
+      <w:pPr>
+        <w:shd w:fill="ffffff" w:val="clear"/>
+        <w:spacing w:after="0" w:line="240" w:lineRule="auto"/>
+        <w:rPr>
+          <w:rFonts w:ascii="Times New Roman" w:cs="Times New Roman" w:eastAsia="Times New Roman" w:hAnsi="Times New Roman"/>
+          <w:b w:val="0"/>
+          <w:bCs w:val="0"/>
+          <w:color w:val="000000"/>
+          <w:sz w:val="25"/>
+          <w:szCs w:val="25"/>
+        </w:rPr>
+      </w:pPr>
+      <w:r>
+        <w:rPr>
+          <w:rFonts w:ascii="Times New Roman" w:cs="Times New Roman" w:eastAsia="Times New Roman" w:hAnsi="Times New Roman"/>
+          <w:b w:val="0"/>
+          <w:bCs w:val="0"/>
+          <w:color w:val="000000"/>
+          <w:sz w:val="25"/>
+          <w:szCs w:val="25"/>
+          <w:rtl w:val="0"/>
+        </w:rPr>
+        <w:t xml:space="preserve"/>
+      </w:r>
+      <w:r>
+        <w:rPr>
+          <w:rFonts w:ascii="Times New Roman" w:cs="Times New Roman" w:eastAsia="Times New Roman" w:hAnsi="Times New Roman"/>
+          <w:sz w:val="25"/>
+          <w:szCs w:val="25"/>
+          <w:rtl w:val="0"/>
+        </w:rPr>
+        <w:t xml:space="preserve"/>
+      </w:r>
+      <w:r>
+        <w:rPr>
+          <w:rtl w:val="0"/>
+        </w:rPr>
+      </w:r>
+    </w:p>
+    <w:p>
+      <w:pPr>
+        <w:shd w:fill="ffffff" w:val="clear"/>
+        <w:spacing w:after="0" w:line="240" w:lineRule="auto"/>
+        <w:rPr>
+          <w:rFonts w:ascii="Times New Roman" w:cs="Times New Roman" w:eastAsia="Times New Roman" w:hAnsi="Times New Roman"/>
+          <w:sz w:val="25"/>
+          <w:szCs w:val="25"/>
+        </w:rPr>
+      </w:pPr>
+      <w:r>
+        <w:rPr>
+          <w:rFonts w:ascii="Times New Roman" w:cs="Times New Roman" w:eastAsia="Times New Roman" w:hAnsi="Times New Roman"/>
+          <w:sz w:val="25"/>
+          <w:szCs w:val="25"/>
+          <w:rtl w:val="0"/>
+        </w:rPr>
+        <w:t xml:space="preserve"/>
       </w:r>
     </w:p>
     <w:p>
@@ -917,6 +1129,15 @@
       </w:r>
       <w:r>
         <w:rPr>
+          <w:rFonts w:ascii="Times New Roman" w:cs="Times New Roman" w:eastAsia="Times New Roman" w:hAnsi="Times New Roman"/>
+          <w:sz w:val="25"/>
+          <w:szCs w:val="25"/>
+          <w:rtl w:val="0"/>
+        </w:rPr>
+        <w:t xml:space="preserve"/>
+      </w:r>
+      <w:r>
+        <w:rPr>
           <w:rtl w:val="0"/>
         </w:rPr>
       </w:r>
@@ -978,6 +1199,34 @@
       </w:r>
       <w:r>
         <w:rPr>
+          <w:rFonts w:ascii="Times New Roman" w:cs="Times New Roman" w:eastAsia="Times New Roman" w:hAnsi="Times New Roman"/>
+          <w:b w:val="0"/>
+          <w:bCs w:val="0"/>
+          <w:i w:val="0"/>
+          <w:iCs w:val="0"/>
+          <w:smallCaps w:val="0"/>
+          <w:strike w:val="0"/>
+          <w:color w:val="000000"/>
+          <w:sz w:val="25"/>
+          <w:szCs w:val="25"/>
+          <w:u w:val="none"/>
+          <w:shd w:fill="auto" w:val="clear"/>
+          <w:vertAlign w:val="baseline"/>
+          <w:rtl w:val="0"/>
+        </w:rPr>
+        <w:t xml:space="preserve"/>
+      </w:r>
+      <w:r>
+        <w:rPr>
+          <w:rFonts w:ascii="Times New Roman" w:cs="Times New Roman" w:eastAsia="Times New Roman" w:hAnsi="Times New Roman"/>
+          <w:sz w:val="25"/>
+          <w:szCs w:val="25"/>
+          <w:rtl w:val="0"/>
+        </w:rPr>
+        <w:t xml:space="preserve"/>
+      </w:r>
+      <w:r>
+        <w:rPr>
           <w:rtl w:val="0"/>
         </w:rPr>
       </w:r>
@@ -1091,6 +1340,75 @@
           <w:rtl w:val="0"/>
         </w:rPr>
         <w:t xml:space="preserve">Điều 3: Thời hạn thuê ${leaseDurationMonths} tháng, từ ngày ${startDate} đến ngày ${endDate}</w:t>
+      </w:r>
+      <w:r>
+        <w:rPr>
+          <w:rFonts w:ascii="Times New Roman" w:cs="Times New Roman" w:eastAsia="Times New Roman" w:hAnsi="Times New Roman"/>
+          <w:b w:val="1"/>
+          <w:bCs w:val="1"/>
+          <w:color w:val="000000"/>
+          <w:sz w:val="25"/>
+          <w:szCs w:val="25"/>
+          <w:rtl w:val="0"/>
+        </w:rPr>
+        <w:t xml:space="preserve"/>
+      </w:r>
+      <w:r>
+        <w:rPr>
+          <w:rFonts w:ascii="Times New Roman" w:cs="Times New Roman" w:eastAsia="Times New Roman" w:hAnsi="Times New Roman"/>
+          <w:color w:val="000000"/>
+          <w:sz w:val="25"/>
+          <w:szCs w:val="25"/>
+          <w:rtl w:val="0"/>
+        </w:rPr>
+        <w:t xml:space="preserve"/>
+      </w:r>
+      <w:r>
+        <w:rPr>
+          <w:rFonts w:ascii="Times New Roman" w:cs="Times New Roman" w:eastAsia="Times New Roman" w:hAnsi="Times New Roman"/>
+          <w:sz w:val="25"/>
+          <w:szCs w:val="25"/>
+          <w:rtl w:val="0"/>
+        </w:rPr>
+        <w:t xml:space="preserve"/>
+      </w:r>
+      <w:r>
+        <w:rPr>
+          <w:rFonts w:ascii="Times New Roman" w:cs="Times New Roman" w:eastAsia="Times New Roman" w:hAnsi="Times New Roman"/>
+          <w:color w:val="000000"/>
+          <w:sz w:val="25"/>
+          <w:szCs w:val="25"/>
+          <w:rtl w:val="0"/>
+        </w:rPr>
+        <w:t xml:space="preserve"/>
+      </w:r>
+      <w:r>
+        <w:rPr>
+          <w:rFonts w:ascii="Times New Roman" w:cs="Times New Roman" w:eastAsia="Times New Roman" w:hAnsi="Times New Roman"/>
+          <w:sz w:val="25"/>
+          <w:szCs w:val="25"/>
+          <w:rtl w:val="0"/>
+        </w:rPr>
+        <w:t xml:space="preserve"/>
+      </w:r>
+      <w:r>
+        <w:rPr>
+          <w:rFonts w:ascii="Times New Roman" w:cs="Times New Roman" w:eastAsia="Times New Roman" w:hAnsi="Times New Roman"/>
+          <w:color w:val="000000"/>
+          <w:sz w:val="25"/>
+          <w:szCs w:val="25"/>
+          <w:rtl w:val="0"/>
+        </w:rPr>
+        <w:t xml:space="preserve"/>
+      </w:r>
+      <w:r>
+        <w:rPr>
+          <w:rFonts w:ascii="Times New Roman" w:cs="Times New Roman" w:eastAsia="Times New Roman" w:hAnsi="Times New Roman"/>
+          <w:sz w:val="25"/>
+          <w:szCs w:val="25"/>
+          <w:rtl w:val="0"/>
+        </w:rPr>
+        <w:t xml:space="preserve"/>
       </w:r>
       <w:r>
         <w:rPr>
@@ -1167,6 +1485,17 @@
       </w:r>
       <w:r>
         <w:rPr>
+          <w:rFonts w:ascii="Times New Roman" w:cs="Times New Roman" w:eastAsia="Times New Roman" w:hAnsi="Times New Roman"/>
+          <w:b w:val="1"/>
+          <w:bCs w:val="1"/>
+          <w:sz w:val="25"/>
+          <w:szCs w:val="25"/>
+          <w:rtl w:val="0"/>
+        </w:rPr>
+        <w:t xml:space="preserve"/>
+      </w:r>
+      <w:r>
+        <w:rPr>
           <w:rtl w:val="0"/>
         </w:rPr>
       </w:r>
@@ -1292,28 +1621,52 @@
       </w:r>
       <w:r>
         <w:rPr>
-          <w:rtl w:val="0"/>
-        </w:rPr>
-      </w:r>
-    </w:p>
-    <w:p>
-      <w:pPr>
-        <w:shd w:fill="ffffff" w:val="clear"/>
-        <w:spacing w:after="0" w:line="240" w:lineRule="auto"/>
-        <w:jc w:val="both"/>
-        <w:rPr>
-          <w:rFonts w:ascii="Times New Roman" w:cs="Times New Roman" w:eastAsia="Times New Roman" w:hAnsi="Times New Roman"/>
-          <w:b w:val="1"/>
-          <w:bCs w:val="1"/>
-          <w:color w:val="000000"/>
-          <w:sz w:val="25"/>
-          <w:szCs w:val="25"/>
-        </w:rPr>
-      </w:pPr>
-      <w:r>
-        <w:rPr>
-          <w:rtl w:val="0"/>
-        </w:rPr>
+          <w:rFonts w:ascii="Times New Roman" w:cs="Times New Roman" w:eastAsia="Times New Roman" w:hAnsi="Times New Roman"/>
+          <w:b w:val="1"/>
+          <w:bCs w:val="1"/>
+          <w:sz w:val="25"/>
+          <w:szCs w:val="25"/>
+          <w:rtl w:val="0"/>
+        </w:rPr>
+        <w:t xml:space="preserve"/>
+      </w:r>
+    </w:p>
+    <w:p>
+      <w:pPr>
+        <w:shd w:fill="ffffff" w:val="clear"/>
+        <w:spacing w:after="0" w:line="240" w:lineRule="auto"/>
+        <w:jc w:val="both"/>
+        <w:rPr>
+          <w:rFonts w:ascii="Times New Roman" w:cs="Times New Roman" w:eastAsia="Times New Roman" w:hAnsi="Times New Roman"/>
+          <w:b w:val="1"/>
+          <w:bCs w:val="1"/>
+          <w:color w:val="000000"/>
+          <w:sz w:val="25"/>
+          <w:szCs w:val="25"/>
+        </w:rPr>
+      </w:pPr>
+      <w:r>
+        <w:rPr>
+          <w:rFonts w:ascii="Times New Roman" w:cs="Times New Roman" w:eastAsia="Times New Roman" w:hAnsi="Times New Roman"/>
+          <w:b w:val="1"/>
+          <w:bCs w:val="1"/>
+          <w:sz w:val="25"/>
+          <w:szCs w:val="25"/>
+          <w:rtl w:val="0"/>
+        </w:rPr>
+        <w:t xml:space="preserve"/>
+      </w:r>
+      <w:r>
+        <w:rPr>
+          <w:rFonts w:ascii="Times New Roman" w:cs="Times New Roman" w:eastAsia="Times New Roman" w:hAnsi="Times New Roman"/>
+          <w:b w:val="1"/>
+          <w:bCs w:val="1"/>
+          <w:color w:val="000000"/>
+          <w:sz w:val="25"/>
+          <w:szCs w:val="25"/>
+          <w:rtl w:val="0"/>
+        </w:rPr>
+        <w:t xml:space="preserve"/>
       </w:r>
     </w:p>
     <w:p>
@@ -1387,6 +1740,20 @@
         </w:rPr>
         <w:t xml:space="preserve">Số tài khoản: </w:t>
       </w:r>
+      <w:r>
+        <w:rPr>
+          <w:rFonts w:ascii="Times New Roman" w:cs="Times New Roman" w:eastAsia="Times New Roman" w:hAnsi="Times New Roman"/>
+          <w:sz w:val="25"/>
+          <w:szCs w:val="25"/>
+          <w:rtl w:val="0"/>
+        </w:rPr>
+        <w:t xml:space="preserve"/>
+      </w:r>
+      <w:r>
+        <w:rPr>
+          <w:rtl w:val="0"/>
+        </w:rPr>
+      </w:r>
     </w:p>
     <w:p>
       <w:pPr>
@@ -1413,6 +1780,22 @@
         </w:rPr>
         <w:t xml:space="preserve">Chủ tài khoản: </w:t>
       </w:r>
+      <w:r>
+        <w:rPr>
+          <w:rFonts w:ascii="Times New Roman" w:cs="Times New Roman" w:eastAsia="Times New Roman" w:hAnsi="Times New Roman"/>
+          <w:b w:val="1"/>
+          <w:bCs w:val="1"/>
+          <w:sz w:val="25"/>
+          <w:szCs w:val="25"/>
+          <w:rtl w:val="0"/>
+        </w:rPr>
+        <w:t xml:space="preserve"/>
+      </w:r>
+      <w:r>
+        <w:rPr>
+          <w:rtl w:val="0"/>
+        </w:rPr>
+      </w:r>
     </w:p>
     <w:p>
       <w:pPr>
@@ -1440,6 +1823,20 @@
         </w:rPr>
         <w:t xml:space="preserve">Ngân hàng: </w:t>
       </w:r>
+      <w:r>
+        <w:rPr>
+          <w:rFonts w:ascii="Times New Roman" w:cs="Times New Roman" w:eastAsia="Times New Roman" w:hAnsi="Times New Roman"/>
+          <w:sz w:val="25"/>
+          <w:szCs w:val="25"/>
+          <w:rtl w:val="0"/>
+        </w:rPr>
+        <w:t xml:space="preserve"/>
+      </w:r>
+      <w:r>
+        <w:rPr>
+          <w:rtl w:val="0"/>
+        </w:rPr>
+      </w:r>
     </w:p>
     <w:p>
       <w:pPr>
@@ -1532,6 +1929,17 @@
       </w:r>
       <w:r>
         <w:rPr>
+          <w:rFonts w:ascii="Times New Roman" w:cs="Times New Roman" w:eastAsia="Times New Roman" w:hAnsi="Times New Roman"/>
+          <w:b w:val="1"/>
+          <w:bCs w:val="1"/>
+          <w:sz w:val="25"/>
+          <w:szCs w:val="25"/>
+          <w:rtl w:val="0"/>
+        </w:rPr>
+        <w:t xml:space="preserve"/>
+      </w:r>
+      <w:r>
+        <w:rPr>
           <w:rtl w:val="0"/>
         </w:rPr>
       </w:r>
@@ -1561,28 +1969,52 @@
       </w:r>
       <w:r>
         <w:rPr>
-          <w:rtl w:val="0"/>
-        </w:rPr>
-      </w:r>
-    </w:p>
-    <w:p>
-      <w:pPr>
-        <w:shd w:fill="ffffff" w:val="clear"/>
-        <w:spacing w:after="0" w:line="240" w:lineRule="auto"/>
-        <w:jc w:val="both"/>
-        <w:rPr>
-          <w:rFonts w:ascii="Times New Roman" w:cs="Times New Roman" w:eastAsia="Times New Roman" w:hAnsi="Times New Roman"/>
-          <w:b w:val="1"/>
-          <w:bCs w:val="1"/>
-          <w:color w:val="000000"/>
-          <w:sz w:val="25"/>
-          <w:szCs w:val="25"/>
-        </w:rPr>
-      </w:pPr>
-      <w:r>
-        <w:rPr>
-          <w:rtl w:val="0"/>
-        </w:rPr>
+          <w:rFonts w:ascii="Times New Roman" w:cs="Times New Roman" w:eastAsia="Times New Roman" w:hAnsi="Times New Roman"/>
+          <w:b w:val="1"/>
+          <w:bCs w:val="1"/>
+          <w:sz w:val="25"/>
+          <w:szCs w:val="25"/>
+          <w:rtl w:val="0"/>
+        </w:rPr>
+        <w:t xml:space="preserve"/>
+      </w:r>
+    </w:p>
+    <w:p>
+      <w:pPr>
+        <w:shd w:fill="ffffff" w:val="clear"/>
+        <w:spacing w:after="0" w:line="240" w:lineRule="auto"/>
+        <w:jc w:val="both"/>
+        <w:rPr>
+          <w:rFonts w:ascii="Times New Roman" w:cs="Times New Roman" w:eastAsia="Times New Roman" w:hAnsi="Times New Roman"/>
+          <w:b w:val="1"/>
+          <w:bCs w:val="1"/>
+          <w:color w:val="000000"/>
+          <w:sz w:val="25"/>
+          <w:szCs w:val="25"/>
+        </w:rPr>
+      </w:pPr>
+      <w:r>
+        <w:rPr>
+          <w:rFonts w:ascii="Times New Roman" w:cs="Times New Roman" w:eastAsia="Times New Roman" w:hAnsi="Times New Roman"/>
+          <w:b w:val="1"/>
+          <w:bCs w:val="1"/>
+          <w:sz w:val="25"/>
+          <w:szCs w:val="25"/>
+          <w:rtl w:val="0"/>
+        </w:rPr>
+        <w:t xml:space="preserve"/>
+      </w:r>
+      <w:r>
+        <w:rPr>
+          <w:rFonts w:ascii="Times New Roman" w:cs="Times New Roman" w:eastAsia="Times New Roman" w:hAnsi="Times New Roman"/>
+          <w:b w:val="1"/>
+          <w:bCs w:val="1"/>
+          <w:color w:val="000000"/>
+          <w:sz w:val="25"/>
+          <w:szCs w:val="25"/>
+          <w:rtl w:val="0"/>
+        </w:rPr>
+        <w:t xml:space="preserve"/>
       </w:r>
     </w:p>
     <w:p>
@@ -1790,7 +2222,7 @@
           <w:szCs w:val="25"/>
         </w:rPr>
       </w:pPr>
-      <w:bookmarkStart w:colFirst="0" w:colLast="0" w:name="_ayqohw9mimd" w:id="0"/>
+      <w:bookmarkStart w:colFirst="0" w:colLast="0" w:name="_d44hj62sqxud" w:id="0"/>
       <w:bookmarkEnd w:id="0"/>
       <w:r>
         <w:rPr>
@@ -1804,43 +2236,66 @@
       </w:r>
       <w:r>
         <w:rPr>
-          <w:rtl w:val="0"/>
-        </w:rPr>
-      </w:r>
-    </w:p>
-    <w:p>
-      <w:pPr>
-        <w:shd w:fill="ffffff" w:val="clear"/>
-        <w:spacing w:after="150" w:line="240" w:lineRule="auto"/>
-        <w:rPr>
-          <w:rFonts w:ascii="Times New Roman" w:cs="Times New Roman" w:eastAsia="Times New Roman" w:hAnsi="Times New Roman"/>
-          <w:b w:val="1"/>
-          <w:bCs w:val="1"/>
-          <w:sz w:val="25"/>
-          <w:szCs w:val="25"/>
-        </w:rPr>
-      </w:pPr>
-      <w:bookmarkStart w:colFirst="0" w:colLast="0" w:name="_ksk3rfo41r40" w:id="1"/>
+          <w:rFonts w:ascii="Times New Roman" w:cs="Times New Roman" w:eastAsia="Times New Roman" w:hAnsi="Times New Roman"/>
+          <w:b w:val="1"/>
+          <w:bCs w:val="1"/>
+          <w:sz w:val="25"/>
+          <w:szCs w:val="25"/>
+          <w:rtl w:val="0"/>
+        </w:rPr>
+        <w:t xml:space="preserve"/>
+      </w:r>
+    </w:p>
+    <w:p>
+      <w:pPr>
+        <w:shd w:fill="ffffff" w:val="clear"/>
+        <w:spacing w:after="150" w:line="240" w:lineRule="auto"/>
+        <w:rPr>
+          <w:rFonts w:ascii="Times New Roman" w:cs="Times New Roman" w:eastAsia="Times New Roman" w:hAnsi="Times New Roman"/>
+          <w:b w:val="1"/>
+          <w:bCs w:val="1"/>
+          <w:sz w:val="25"/>
+          <w:szCs w:val="25"/>
+        </w:rPr>
+      </w:pPr>
+      <w:bookmarkStart w:colFirst="0" w:colLast="0" w:name="_vasj75bb9sxk" w:id="1"/>
       <w:bookmarkEnd w:id="1"/>
       <w:r>
         <w:rPr>
-          <w:rtl w:val="0"/>
-        </w:rPr>
-      </w:r>
-    </w:p>
-    <w:p>
-      <w:pPr>
-        <w:shd w:fill="ffffff" w:val="clear"/>
-        <w:spacing w:after="150" w:line="240" w:lineRule="auto"/>
-        <w:rPr>
-          <w:rFonts w:ascii="Times New Roman" w:cs="Times New Roman" w:eastAsia="Times New Roman" w:hAnsi="Times New Roman"/>
-          <w:color w:val="000000"/>
-          <w:sz w:val="25"/>
-          <w:szCs w:val="25"/>
-        </w:rPr>
-      </w:pPr>
-      <w:bookmarkStart w:colFirst="0" w:colLast="0" w:name="_eahk9xdiq8wz" w:id="2"/>
+          <w:rFonts w:ascii="Times New Roman" w:cs="Times New Roman" w:eastAsia="Times New Roman" w:hAnsi="Times New Roman"/>
+          <w:b w:val="1"/>
+          <w:bCs w:val="1"/>
+          <w:sz w:val="25"/>
+          <w:szCs w:val="25"/>
+          <w:rtl w:val="0"/>
+        </w:rPr>
+        <w:t xml:space="preserve"/>
+      </w:r>
+    </w:p>
+    <w:p>
+      <w:pPr>
+        <w:shd w:fill="ffffff" w:val="clear"/>
+        <w:spacing w:after="150" w:line="240" w:lineRule="auto"/>
+        <w:rPr>
+          <w:rFonts w:ascii="Times New Roman" w:cs="Times New Roman" w:eastAsia="Times New Roman" w:hAnsi="Times New Roman"/>
+          <w:color w:val="000000"/>
+          <w:sz w:val="25"/>
+          <w:szCs w:val="25"/>
+        </w:rPr>
+      </w:pPr>
+      <w:bookmarkStart w:colFirst="0" w:colLast="0" w:name="_xcwqusnyahi" w:id="2"/>
       <w:bookmarkEnd w:id="2"/>
+      <w:r>
+        <w:rPr>
+          <w:rFonts w:ascii="Times New Roman" w:cs="Times New Roman" w:eastAsia="Times New Roman" w:hAnsi="Times New Roman"/>
+          <w:b w:val="1"/>
+          <w:bCs w:val="1"/>
+          <w:sz w:val="25"/>
+          <w:szCs w:val="25"/>
+          <w:rtl w:val="0"/>
+        </w:rPr>
+        <w:t xml:space="preserve"/>
+      </w:r>
       <w:r>
         <w:rPr>
           <w:rFonts w:ascii="Times New Roman" w:cs="Times New Roman" w:eastAsia="Times New Roman" w:hAnsi="Times New Roman"/>
@@ -2757,8 +3212,13 @@
             </w:pPr>
             <w:r>
               <w:rPr>
+                <w:rFonts w:ascii="Times New Roman" w:cs="Times New Roman" w:eastAsia="Times New Roman" w:hAnsi="Times New Roman"/>
+                <w:color w:val="000000"/>
+                <w:sz w:val="25"/>
+                <w:szCs w:val="25"/>
                 <w:rtl w:val="0"/>
               </w:rPr>
+              <w:t xml:space="preserve"/>
             </w:r>
           </w:p>
         </w:tc>

</xml_diff>

<commit_message>
fix bulk tenant draft contract import
</commit_message>
<xml_diff>
--- a/src/main/resources/templates/contract/tenant-apartment-draft-template.docx
+++ b/src/main/resources/templates/contract/tenant-apartment-draft-template.docx
@@ -571,7 +571,8 @@
           <w:szCs w:val="25"/>
           <w:rtl w:val="0"/>
         </w:rPr>
-        <w:t xml:space="preserve">Ông/bà: ${tenantFullName}</w:t>
+        <w:t xml:space="preserve">Ông/bà: ${tenantFullName}
+</w:t>
       </w:r>
       <w:r>
         <w:rPr>
@@ -630,7 +631,8 @@
           <w:szCs w:val="25"/>
           <w:rtl w:val="0"/>
         </w:rPr>
-        <w:t xml:space="preserve">Số CCCD: ${tenantCccd}</w:t>
+        <w:t xml:space="preserve">Số CCCD: ${tenantCccd}
+</w:t>
       </w:r>
       <w:r>
         <w:rPr>
@@ -651,7 +653,8 @@
           <w:szCs w:val="25"/>
           <w:rtl w:val="0"/>
         </w:rPr>
-        <w:t xml:space="preserve">Ngày sinh: ${tenantDob}</w:t>
+        <w:t xml:space="preserve">Ngày sinh: ${tenantDob}
+</w:t>
       </w:r>
       <w:r>
         <w:rPr>
@@ -672,7 +675,8 @@
           <w:szCs w:val="25"/>
           <w:rtl w:val="0"/>
         </w:rPr>
-        <w:t xml:space="preserve">Cấp ngày: ${tenantCccdIssueDate} — Nơi cấp: ${tenantCccdIssuePlace}</w:t>
+        <w:t xml:space="preserve">Cấp ngày: ${tenantCccdIssueDate} — Nơi cấp: ${tenantCccdIssuePlace}
+</w:t>
       </w:r>
       <w:r>
         <w:rPr>
@@ -712,82 +716,85 @@
           <w:szCs w:val="25"/>
           <w:rtl w:val="0"/>
         </w:rPr>
-        <w:t xml:space="preserve">HKTT: ${tenantAddress}</w:t>
-      </w:r>
-      <w:r>
-        <w:rPr>
-          <w:rFonts w:ascii="Times New Roman" w:cs="Times New Roman" w:eastAsia="Times New Roman" w:hAnsi="Times New Roman"/>
-          <w:sz w:val="25"/>
-          <w:szCs w:val="25"/>
-          <w:rtl w:val="0"/>
-        </w:rPr>
-        <w:t xml:space="preserve"/>
-      </w:r>
-      <w:r>
-        <w:rPr>
-          <w:rtl w:val="0"/>
-        </w:rPr>
-      </w:r>
-    </w:p>
-    <w:p>
-      <w:pPr>
-        <w:shd w:fill="ffffff" w:val="clear"/>
-        <w:spacing w:after="0" w:line="240" w:lineRule="auto"/>
-        <w:rPr>
-          <w:rFonts w:ascii="Times New Roman" w:cs="Times New Roman" w:eastAsia="Times New Roman" w:hAnsi="Times New Roman"/>
-          <w:color w:val="000000"/>
-          <w:sz w:val="25"/>
-          <w:szCs w:val="25"/>
-        </w:rPr>
-      </w:pPr>
-      <w:r>
-        <w:rPr>
-          <w:rFonts w:ascii="Times New Roman" w:cs="Times New Roman" w:eastAsia="Times New Roman" w:hAnsi="Times New Roman"/>
-          <w:color w:val="000000"/>
-          <w:sz w:val="25"/>
-          <w:szCs w:val="25"/>
-          <w:rtl w:val="0"/>
-        </w:rPr>
-        <w:t xml:space="preserve">Điện thoại: ${tenantPhone}</w:t>
-      </w:r>
-    </w:p>
-    <w:p>
-      <w:pPr>
-        <w:shd w:fill="ffffff" w:val="clear"/>
-        <w:spacing w:after="0" w:line="240" w:lineRule="auto"/>
-        <w:rPr>
-          <w:rFonts w:ascii="Times New Roman" w:cs="Times New Roman" w:eastAsia="Times New Roman" w:hAnsi="Times New Roman"/>
-          <w:color w:val="000000"/>
-          <w:sz w:val="25"/>
-          <w:szCs w:val="25"/>
-        </w:rPr>
-      </w:pPr>
-      <w:r>
-        <w:rPr>
-          <w:rtl w:val="0"/>
-        </w:rPr>
-      </w:r>
-    </w:p>
-    <w:p>
-      <w:pPr>
-        <w:shd w:fill="ffffff" w:val="clear"/>
-        <w:spacing w:after="0" w:line="240" w:lineRule="auto"/>
-        <w:rPr>
-          <w:rFonts w:ascii="Times New Roman" w:cs="Times New Roman" w:eastAsia="Times New Roman" w:hAnsi="Times New Roman"/>
-          <w:color w:val="000000"/>
-          <w:sz w:val="25"/>
-          <w:szCs w:val="25"/>
-        </w:rPr>
-      </w:pPr>
-      <w:r>
-        <w:rPr>
-          <w:rFonts w:ascii="Times New Roman" w:cs="Times New Roman" w:eastAsia="Times New Roman" w:hAnsi="Times New Roman"/>
-          <w:color w:val="000000"/>
-          <w:sz w:val="25"/>
-          <w:szCs w:val="25"/>
-          <w:rtl w:val="0"/>
-        </w:rPr>
-        <w:t xml:space="preserve">Người ở cùng: ${householdMembers}</w:t>
+        <w:t xml:space="preserve">HKTT: ${tenantAddress}
+</w:t>
+      </w:r>
+      <w:r>
+        <w:rPr>
+          <w:rFonts w:ascii="Times New Roman" w:cs="Times New Roman" w:eastAsia="Times New Roman" w:hAnsi="Times New Roman"/>
+          <w:sz w:val="25"/>
+          <w:szCs w:val="25"/>
+          <w:rtl w:val="0"/>
+        </w:rPr>
+        <w:t xml:space="preserve"/>
+      </w:r>
+      <w:r>
+        <w:rPr>
+          <w:rtl w:val="0"/>
+        </w:rPr>
+      </w:r>
+    </w:p>
+    <w:p>
+      <w:pPr>
+        <w:shd w:fill="ffffff" w:val="clear"/>
+        <w:spacing w:after="0" w:line="240" w:lineRule="auto"/>
+        <w:rPr>
+          <w:rFonts w:ascii="Times New Roman" w:cs="Times New Roman" w:eastAsia="Times New Roman" w:hAnsi="Times New Roman"/>
+          <w:color w:val="000000"/>
+          <w:sz w:val="25"/>
+          <w:szCs w:val="25"/>
+        </w:rPr>
+      </w:pPr>
+      <w:r>
+        <w:rPr>
+          <w:rFonts w:ascii="Times New Roman" w:cs="Times New Roman" w:eastAsia="Times New Roman" w:hAnsi="Times New Roman"/>
+          <w:color w:val="000000"/>
+          <w:sz w:val="25"/>
+          <w:szCs w:val="25"/>
+          <w:rtl w:val="0"/>
+        </w:rPr>
+        <w:t xml:space="preserve">Điện thoại: ${tenantPhone}
+</w:t>
+      </w:r>
+    </w:p>
+    <w:p>
+      <w:pPr>
+        <w:shd w:fill="ffffff" w:val="clear"/>
+        <w:spacing w:after="0" w:line="240" w:lineRule="auto"/>
+        <w:rPr>
+          <w:rFonts w:ascii="Times New Roman" w:cs="Times New Roman" w:eastAsia="Times New Roman" w:hAnsi="Times New Roman"/>
+          <w:color w:val="000000"/>
+          <w:sz w:val="25"/>
+          <w:szCs w:val="25"/>
+        </w:rPr>
+      </w:pPr>
+      <w:r>
+        <w:rPr>
+          <w:rtl w:val="0"/>
+        </w:rPr>
+      </w:r>
+    </w:p>
+    <w:p>
+      <w:pPr>
+        <w:shd w:fill="ffffff" w:val="clear"/>
+        <w:spacing w:after="0" w:line="240" w:lineRule="auto"/>
+        <w:rPr>
+          <w:rFonts w:ascii="Times New Roman" w:cs="Times New Roman" w:eastAsia="Times New Roman" w:hAnsi="Times New Roman"/>
+          <w:color w:val="000000"/>
+          <w:sz w:val="25"/>
+          <w:szCs w:val="25"/>
+        </w:rPr>
+      </w:pPr>
+      <w:r>
+        <w:rPr>
+          <w:rFonts w:ascii="Times New Roman" w:cs="Times New Roman" w:eastAsia="Times New Roman" w:hAnsi="Times New Roman"/>
+          <w:color w:val="000000"/>
+          <w:sz w:val="25"/>
+          <w:szCs w:val="25"/>
+          <w:rtl w:val="0"/>
+        </w:rPr>
+        <w:t xml:space="preserve">Người ở cùng: ${householdMembers}
+</w:t>
       </w:r>
     </w:p>
     <w:p>
@@ -1124,7 +1131,8 @@
           <w:vertAlign w:val="baseline"/>
           <w:rtl w:val="0"/>
         </w:rPr>
-        <w:t xml:space="preserve">Bên A đồng ý cho thuê và bên B đồng ý thuê căn hộ: ${rentalUnit}</w:t>
+        <w:t xml:space="preserve">Bên A đồng ý cho thuê và bên B đồng ý thuê căn hộ: ${rentalUnit}
+</w:t>
         <w:br w:type="textWrapping"/>
       </w:r>
       <w:r>

</xml_diff>